<commit_message>
updated solution to use wikipedia files and also added a script to download the wiki files
</commit_message>
<xml_diff>
--- a/Capstone Checkpoint 1.1/Worksheet/Required_Capstone_Checkpoint_1_1_Worksheet.docx
+++ b/Capstone Checkpoint 1.1/Worksheet/Required_Capstone_Checkpoint_1_1_Worksheet.docx
@@ -244,7 +244,27 @@
           <w:sz w:val="24"/>
           <w:szCs w:val="24"/>
         </w:rPr>
-        <w:t>Reflect on how retrieval quality affects reliability and user trust</w:t>
+        <w:t xml:space="preserve">Reflect on how retrieval quality </w:t>
+      </w:r>
+      <w:proofErr w:type="gramStart"/>
+      <w:r>
+        <w:rPr>
+          <w:rFonts w:eastAsia="Aptos"/>
+          <w:color w:val="000000"/>
+          <w:sz w:val="24"/>
+          <w:szCs w:val="24"/>
+        </w:rPr>
+        <w:t>affects</w:t>
+      </w:r>
+      <w:proofErr w:type="gramEnd"/>
+      <w:r>
+        <w:rPr>
+          <w:rFonts w:eastAsia="Aptos"/>
+          <w:color w:val="000000"/>
+          <w:sz w:val="24"/>
+          <w:szCs w:val="24"/>
+        </w:rPr>
+        <w:t xml:space="preserve"> reliability and user trust</w:t>
       </w:r>
     </w:p>
     <w:p>
@@ -843,6 +863,7 @@
           </w:tcPr>
           <w:p>
             <w:pPr>
+              <w:spacing w:after="120"/>
               <w:rPr>
                 <w:sz w:val="24"/>
                 <w:szCs w:val="24"/>
@@ -855,46 +876,64 @@
               </w:rPr>
               <w:t>Prompt</w:t>
             </w:r>
-            <w:r>
-              <w:rPr>
-                <w:sz w:val="24"/>
-                <w:szCs w:val="24"/>
-              </w:rPr>
-              <w:t xml:space="preserve"> with history on</w:t>
-            </w:r>
-          </w:p>
-          <w:p>
-            <w:pPr>
-              <w:rPr>
-                <w:sz w:val="24"/>
-                <w:szCs w:val="24"/>
-              </w:rPr>
-            </w:pPr>
-            <w:r>
-              <w:rPr>
-                <w:sz w:val="24"/>
-                <w:szCs w:val="24"/>
-              </w:rPr>
-              <w:t>When was the war of 1812?</w:t>
-            </w:r>
-          </w:p>
-          <w:p>
-            <w:pPr>
-              <w:rPr>
-                <w:sz w:val="24"/>
-                <w:szCs w:val="24"/>
-              </w:rPr>
-            </w:pPr>
-            <w:r>
-              <w:rPr>
-                <w:sz w:val="24"/>
-                <w:szCs w:val="24"/>
-              </w:rPr>
-              <w:t>Response</w:t>
-            </w:r>
-          </w:p>
-          <w:p>
-            <w:pPr>
+            <w:proofErr w:type="gramStart"/>
+            <w:r>
+              <w:rPr>
+                <w:sz w:val="24"/>
+                <w:szCs w:val="24"/>
+              </w:rPr>
+              <w:t xml:space="preserve">1 </w:t>
+            </w:r>
+            <w:r>
+              <w:rPr>
+                <w:sz w:val="24"/>
+                <w:szCs w:val="24"/>
+              </w:rPr>
+              <w:t>:</w:t>
+            </w:r>
+            <w:proofErr w:type="gramEnd"/>
+            <w:r>
+              <w:rPr>
+                <w:sz w:val="24"/>
+                <w:szCs w:val="24"/>
+              </w:rPr>
+              <w:t xml:space="preserve"> Who was the incumbent in 2022 election?</w:t>
+            </w:r>
+          </w:p>
+          <w:p>
+            <w:pPr>
+              <w:spacing w:after="120"/>
+              <w:rPr>
+                <w:sz w:val="24"/>
+                <w:szCs w:val="24"/>
+              </w:rPr>
+            </w:pPr>
+            <w:r>
+              <w:rPr>
+                <w:sz w:val="24"/>
+                <w:szCs w:val="24"/>
+              </w:rPr>
+              <w:t xml:space="preserve">Response: </w:t>
+            </w:r>
+            <w:r>
+              <w:rPr>
+                <w:sz w:val="24"/>
+                <w:szCs w:val="24"/>
+              </w:rPr>
+              <w:t xml:space="preserve">The incumbent president in the 2022 elections was Joe Biden (D). </w:t>
+            </w:r>
+            <w:r>
+              <w:rPr>
+                <w:sz w:val="24"/>
+                <w:szCs w:val="24"/>
+                <w:highlight w:val="green"/>
+              </w:rPr>
+              <w:t>(Source: 2022_US_elections.txt)</w:t>
+            </w:r>
+          </w:p>
+          <w:p>
+            <w:pPr>
+              <w:spacing w:after="120"/>
               <w:rPr>
                 <w:sz w:val="24"/>
                 <w:szCs w:val="24"/>
@@ -903,14 +942,12 @@
             <w:r>
               <w:rPr>
                 <w:noProof/>
-                <w:sz w:val="24"/>
-                <w:szCs w:val="24"/>
               </w:rPr>
               <w:drawing>
-                <wp:inline distT="0" distB="0" distL="0" distR="0" wp14:anchorId="22D33F89" wp14:editId="40FFFA96">
-                  <wp:extent cx="6263640" cy="1112520"/>
-                  <wp:effectExtent l="0" t="0" r="3810" b="0"/>
-                  <wp:docPr id="558247511" name="Picture 4"/>
+                <wp:inline distT="0" distB="0" distL="0" distR="0" wp14:anchorId="3361AD7D" wp14:editId="1573999C">
+                  <wp:extent cx="6286495" cy="838200"/>
+                  <wp:effectExtent l="0" t="0" r="635" b="0"/>
+                  <wp:docPr id="1375550304" name="Picture 1"/>
                   <wp:cNvGraphicFramePr>
                     <a:graphicFrameLocks xmlns:a="http://schemas.openxmlformats.org/drawingml/2006/main" noChangeAspect="1"/>
                   </wp:cNvGraphicFramePr>
@@ -918,36 +955,23 @@
                     <a:graphicData uri="http://schemas.openxmlformats.org/drawingml/2006/picture">
                       <pic:pic xmlns:pic="http://schemas.openxmlformats.org/drawingml/2006/picture">
                         <pic:nvPicPr>
-                          <pic:cNvPr id="0" name="Picture 6"/>
-                          <pic:cNvPicPr>
-                            <a:picLocks noChangeAspect="1" noChangeArrowheads="1"/>
-                          </pic:cNvPicPr>
+                          <pic:cNvPr id="1375550304" name=""/>
+                          <pic:cNvPicPr/>
                         </pic:nvPicPr>
                         <pic:blipFill>
-                          <a:blip r:embed="rId9" cstate="print">
-                            <a:extLst>
-                              <a:ext uri="{28A0092B-C50C-407E-A947-70E740481C1C}">
-                                <a14:useLocalDpi xmlns:a14="http://schemas.microsoft.com/office/drawing/2010/main" val="0"/>
-                              </a:ext>
-                            </a:extLst>
-                          </a:blip>
-                          <a:srcRect/>
+                          <a:blip r:embed="rId9"/>
                           <a:stretch>
                             <a:fillRect/>
                           </a:stretch>
                         </pic:blipFill>
-                        <pic:spPr bwMode="auto">
+                        <pic:spPr>
                           <a:xfrm>
                             <a:off x="0" y="0"/>
-                            <a:ext cx="6263640" cy="1112520"/>
+                            <a:ext cx="6295865" cy="839449"/>
                           </a:xfrm>
                           <a:prstGeom prst="rect">
                             <a:avLst/>
                           </a:prstGeom>
-                          <a:noFill/>
-                          <a:ln>
-                            <a:noFill/>
-                          </a:ln>
                         </pic:spPr>
                       </pic:pic>
                     </a:graphicData>
@@ -964,15 +988,165 @@
                 <w:szCs w:val="24"/>
               </w:rPr>
             </w:pPr>
-          </w:p>
-          <w:p>
-            <w:pPr>
-              <w:spacing w:after="120"/>
-              <w:rPr>
-                <w:sz w:val="24"/>
-                <w:szCs w:val="24"/>
-              </w:rPr>
-            </w:pPr>
+            <w:r>
+              <w:rPr>
+                <w:sz w:val="24"/>
+                <w:szCs w:val="24"/>
+              </w:rPr>
+              <w:t xml:space="preserve">Prompt2: </w:t>
+            </w:r>
+            <w:r>
+              <w:rPr>
+                <w:sz w:val="24"/>
+                <w:szCs w:val="24"/>
+              </w:rPr>
+              <w:t>What were the main issues for the 2022 election?</w:t>
+            </w:r>
+          </w:p>
+          <w:p>
+            <w:pPr>
+              <w:spacing w:after="120"/>
+              <w:rPr>
+                <w:sz w:val="24"/>
+                <w:szCs w:val="24"/>
+              </w:rPr>
+            </w:pPr>
+            <w:r>
+              <w:rPr>
+                <w:sz w:val="24"/>
+                <w:szCs w:val="24"/>
+              </w:rPr>
+              <w:t xml:space="preserve">Response: </w:t>
+            </w:r>
+            <w:r>
+              <w:rPr>
+                <w:sz w:val="24"/>
+                <w:szCs w:val="24"/>
+              </w:rPr>
+              <w:t>1. **Economy**: High consumer prices, inflation, and gas prices were significant concerns for voters, with Republicans blaming Biden's policies and Democrats linking them to global factors, including the COVID-19 pandemic and the Russian invasion of Ukraine.</w:t>
+            </w:r>
+          </w:p>
+          <w:p>
+            <w:pPr>
+              <w:spacing w:after="120"/>
+              <w:rPr>
+                <w:sz w:val="24"/>
+                <w:szCs w:val="24"/>
+              </w:rPr>
+            </w:pPr>
+            <w:r>
+              <w:rPr>
+                <w:sz w:val="24"/>
+                <w:szCs w:val="24"/>
+              </w:rPr>
+              <w:t>            2. **Abortion**: Following the Supreme Court's ruling in Dobbs v. Jackson Women's Health Organization, abortion became a major issue, influencing several elections and driving Democratic voter turnout.</w:t>
+            </w:r>
+          </w:p>
+          <w:p>
+            <w:pPr>
+              <w:spacing w:after="120"/>
+              <w:rPr>
+                <w:sz w:val="24"/>
+                <w:szCs w:val="24"/>
+              </w:rPr>
+            </w:pPr>
+            <w:r>
+              <w:rPr>
+                <w:sz w:val="24"/>
+                <w:szCs w:val="24"/>
+              </w:rPr>
+              <w:lastRenderedPageBreak/>
+              <w:t>            3. **Crime and Gun Violence**: Mass shootings and rising crime rates contributed to voter concerns, with Republicans emphasizing crime rates and Democrats advocating for gun safety laws.</w:t>
+            </w:r>
+          </w:p>
+          <w:p>
+            <w:pPr>
+              <w:spacing w:after="120"/>
+              <w:rPr>
+                <w:sz w:val="24"/>
+                <w:szCs w:val="24"/>
+              </w:rPr>
+            </w:pPr>
+            <w:r>
+              <w:rPr>
+                <w:sz w:val="24"/>
+                <w:szCs w:val="24"/>
+              </w:rPr>
+              <w:t>            4. **Democracy**: The integrity of democratic institutions and threats posed by election deniers and authoritarianism were highlighted by Democrats as key themes in their campaigns.</w:t>
+            </w:r>
+          </w:p>
+          <w:p>
+            <w:pPr>
+              <w:spacing w:after="120"/>
+              <w:rPr>
+                <w:sz w:val="24"/>
+                <w:szCs w:val="24"/>
+              </w:rPr>
+            </w:pPr>
+            <w:r>
+              <w:rPr>
+                <w:sz w:val="24"/>
+                <w:szCs w:val="24"/>
+              </w:rPr>
+              <w:t xml:space="preserve">            5. **Climate Change**: Climate change emerged as a significant issue, with a majority of voters considering it a serious problem and some candidates actively campaigning on climate-related policies </w:t>
+            </w:r>
+            <w:r>
+              <w:rPr>
+                <w:sz w:val="24"/>
+                <w:szCs w:val="24"/>
+                <w:highlight w:val="green"/>
+              </w:rPr>
+              <w:t>(source: 2022_US_elections.txt).</w:t>
+            </w:r>
+          </w:p>
+          <w:p>
+            <w:pPr>
+              <w:spacing w:after="120"/>
+              <w:rPr>
+                <w:sz w:val="24"/>
+                <w:szCs w:val="24"/>
+              </w:rPr>
+            </w:pPr>
+            <w:r>
+              <w:rPr>
+                <w:noProof/>
+              </w:rPr>
+              <w:drawing>
+                <wp:inline distT="0" distB="0" distL="0" distR="0" wp14:anchorId="7530462C" wp14:editId="5800FE8B">
+                  <wp:extent cx="6263640" cy="1376680"/>
+                  <wp:effectExtent l="0" t="0" r="3810" b="0"/>
+                  <wp:docPr id="225730181" name="Picture 1"/>
+                  <wp:cNvGraphicFramePr>
+                    <a:graphicFrameLocks xmlns:a="http://schemas.openxmlformats.org/drawingml/2006/main" noChangeAspect="1"/>
+                  </wp:cNvGraphicFramePr>
+                  <a:graphic xmlns:a="http://schemas.openxmlformats.org/drawingml/2006/main">
+                    <a:graphicData uri="http://schemas.openxmlformats.org/drawingml/2006/picture">
+                      <pic:pic xmlns:pic="http://schemas.openxmlformats.org/drawingml/2006/picture">
+                        <pic:nvPicPr>
+                          <pic:cNvPr id="225730181" name=""/>
+                          <pic:cNvPicPr/>
+                        </pic:nvPicPr>
+                        <pic:blipFill>
+                          <a:blip r:embed="rId10"/>
+                          <a:stretch>
+                            <a:fillRect/>
+                          </a:stretch>
+                        </pic:blipFill>
+                        <pic:spPr>
+                          <a:xfrm>
+                            <a:off x="0" y="0"/>
+                            <a:ext cx="6263640" cy="1376680"/>
+                          </a:xfrm>
+                          <a:prstGeom prst="rect">
+                            <a:avLst/>
+                          </a:prstGeom>
+                        </pic:spPr>
+                      </pic:pic>
+                    </a:graphicData>
+                  </a:graphic>
+                </wp:inline>
+              </w:drawing>
+            </w:r>
           </w:p>
           <w:p>
             <w:pPr>
@@ -1065,141 +1239,116 @@
                 <w:sz w:val="24"/>
                 <w:szCs w:val="24"/>
               </w:rPr>
-              <w:lastRenderedPageBreak/>
-              <w:t>Prompt with history off</w:t>
-            </w:r>
-          </w:p>
-          <w:p>
-            <w:pPr>
-              <w:spacing w:after="120"/>
-              <w:rPr>
-                <w:sz w:val="24"/>
-                <w:szCs w:val="24"/>
-              </w:rPr>
-            </w:pPr>
-            <w:r>
-              <w:rPr>
-                <w:sz w:val="24"/>
-                <w:szCs w:val="24"/>
-              </w:rPr>
-              <w:t> </w:t>
-            </w:r>
-          </w:p>
-          <w:p>
-            <w:pPr>
-              <w:spacing w:after="120"/>
-              <w:rPr>
-                <w:sz w:val="24"/>
-                <w:szCs w:val="24"/>
-              </w:rPr>
-            </w:pPr>
-            <w:r>
-              <w:rPr>
-                <w:sz w:val="24"/>
-                <w:szCs w:val="24"/>
-              </w:rPr>
-              <w:t>Prompt1</w:t>
-            </w:r>
-          </w:p>
-          <w:p>
-            <w:pPr>
-              <w:spacing w:after="120"/>
-              <w:rPr>
-                <w:sz w:val="24"/>
-                <w:szCs w:val="24"/>
-              </w:rPr>
-            </w:pPr>
-            <w:r>
-              <w:rPr>
-                <w:sz w:val="24"/>
-                <w:szCs w:val="24"/>
-              </w:rPr>
-              <w:t>When was the war of 1812?</w:t>
-            </w:r>
-          </w:p>
-          <w:p>
-            <w:pPr>
-              <w:spacing w:after="120"/>
-              <w:rPr>
-                <w:sz w:val="24"/>
-                <w:szCs w:val="24"/>
-              </w:rPr>
-            </w:pPr>
-            <w:r>
-              <w:rPr>
-                <w:sz w:val="24"/>
-                <w:szCs w:val="24"/>
-              </w:rPr>
-              <w:t> </w:t>
-            </w:r>
-          </w:p>
-          <w:p>
-            <w:pPr>
-              <w:spacing w:after="120"/>
-              <w:rPr>
-                <w:sz w:val="24"/>
-                <w:szCs w:val="24"/>
-              </w:rPr>
-            </w:pPr>
-            <w:r>
-              <w:rPr>
-                <w:sz w:val="24"/>
-                <w:szCs w:val="24"/>
-              </w:rPr>
-              <w:t>Prompt2</w:t>
-            </w:r>
-          </w:p>
-          <w:p>
-            <w:pPr>
-              <w:spacing w:after="120"/>
-              <w:rPr>
-                <w:sz w:val="24"/>
-                <w:szCs w:val="24"/>
-              </w:rPr>
-            </w:pPr>
-            <w:r>
-              <w:rPr>
-                <w:sz w:val="24"/>
-                <w:szCs w:val="24"/>
-              </w:rPr>
-              <w:t>And who won?</w:t>
-            </w:r>
-          </w:p>
-          <w:p>
-            <w:pPr>
-              <w:spacing w:after="120"/>
-              <w:rPr>
-                <w:sz w:val="24"/>
-                <w:szCs w:val="24"/>
-              </w:rPr>
-            </w:pPr>
-            <w:r>
-              <w:rPr>
-                <w:sz w:val="24"/>
-                <w:szCs w:val="24"/>
-              </w:rPr>
-              <w:t> </w:t>
-            </w:r>
-          </w:p>
-          <w:p>
-            <w:pPr>
-              <w:spacing w:after="120"/>
-              <w:rPr>
-                <w:sz w:val="24"/>
-                <w:szCs w:val="24"/>
-              </w:rPr>
-            </w:pPr>
-            <w:r>
-              <w:rPr>
-                <w:noProof/>
+              <w:t>Prompt</w:t>
+            </w:r>
+            <w:proofErr w:type="gramStart"/>
+            <w:r>
+              <w:rPr>
+                <w:sz w:val="24"/>
+                <w:szCs w:val="24"/>
+              </w:rPr>
+              <w:t xml:space="preserve">1 </w:t>
+            </w:r>
+            <w:r>
+              <w:rPr>
+                <w:sz w:val="24"/>
+                <w:szCs w:val="24"/>
+              </w:rPr>
+              <w:t>:</w:t>
+            </w:r>
+            <w:proofErr w:type="gramEnd"/>
+            <w:r>
+              <w:rPr>
+                <w:sz w:val="24"/>
+                <w:szCs w:val="24"/>
+              </w:rPr>
+              <w:t xml:space="preserve"> Who was the incumbent in 2022 election?</w:t>
+            </w:r>
+          </w:p>
+          <w:p>
+            <w:pPr>
+              <w:spacing w:after="120"/>
+              <w:rPr>
+                <w:sz w:val="24"/>
+                <w:szCs w:val="24"/>
+              </w:rPr>
+            </w:pPr>
+            <w:r>
+              <w:rPr>
+                <w:sz w:val="24"/>
+                <w:szCs w:val="24"/>
+              </w:rPr>
+              <w:t xml:space="preserve">Response: </w:t>
+            </w:r>
+          </w:p>
+          <w:p>
+            <w:pPr>
+              <w:spacing w:after="120"/>
+              <w:rPr>
+                <w:sz w:val="24"/>
+                <w:szCs w:val="24"/>
+              </w:rPr>
+            </w:pPr>
+            <w:r>
+              <w:rPr>
+                <w:sz w:val="24"/>
+                <w:szCs w:val="24"/>
+              </w:rPr>
+              <w:t xml:space="preserve">You can find official information regarding the 2022 elections by visiting the </w:t>
+            </w:r>
+            <w:hyperlink r:id="rId11" w:tgtFrame="_blank" w:history="1">
+              <w:r>
+                <w:rPr>
+                  <w:rStyle w:val="Hyperlink"/>
+                  <w:sz w:val="24"/>
+                  <w:szCs w:val="24"/>
+                </w:rPr>
+                <w:t>Federal Election Commission</w:t>
+              </w:r>
+            </w:hyperlink>
+            <w:r>
+              <w:rPr>
+                <w:sz w:val="24"/>
+                <w:szCs w:val="24"/>
+              </w:rPr>
+              <w:t xml:space="preserve"> website or checking resources provided by </w:t>
+            </w:r>
+            <w:hyperlink r:id="rId12" w:tgtFrame="_blank" w:history="1">
+              <w:r>
+                <w:rPr>
+                  <w:rStyle w:val="Hyperlink"/>
+                  <w:sz w:val="24"/>
+                  <w:szCs w:val="24"/>
+                </w:rPr>
+                <w:t>USA.gov</w:t>
+              </w:r>
+            </w:hyperlink>
+            <w:r>
+              <w:rPr>
+                <w:sz w:val="24"/>
+                <w:szCs w:val="24"/>
+              </w:rPr>
+              <w:t>.</w:t>
+            </w:r>
+          </w:p>
+          <w:p>
+            <w:pPr>
+              <w:spacing w:after="120"/>
+              <w:rPr>
+                <w:sz w:val="24"/>
+                <w:szCs w:val="24"/>
+              </w:rPr>
+            </w:pPr>
+            <w:r>
+              <w:rPr>
                 <w:sz w:val="24"/>
                 <w:szCs w:val="24"/>
               </w:rPr>
               <w:drawing>
-                <wp:inline distT="0" distB="0" distL="0" distR="0" wp14:anchorId="1F88AC67" wp14:editId="7BE26383">
-                  <wp:extent cx="6263640" cy="1737995"/>
-                  <wp:effectExtent l="0" t="0" r="3810" b="0"/>
-                  <wp:docPr id="339306837" name="Picture 6"/>
+                <wp:inline distT="0" distB="0" distL="0" distR="0" wp14:anchorId="3C43AFD0" wp14:editId="4AA03AD7">
+                  <wp:extent cx="5657850" cy="2612357"/>
+                  <wp:effectExtent l="0" t="0" r="0" b="0"/>
+                  <wp:docPr id="1903709900" name="Picture 1"/>
                   <wp:cNvGraphicFramePr>
                     <a:graphicFrameLocks xmlns:a="http://schemas.openxmlformats.org/drawingml/2006/main" noChangeAspect="1"/>
                   </wp:cNvGraphicFramePr>
@@ -1207,20 +1356,824 @@
                     <a:graphicData uri="http://schemas.openxmlformats.org/drawingml/2006/picture">
                       <pic:pic xmlns:pic="http://schemas.openxmlformats.org/drawingml/2006/picture">
                         <pic:nvPicPr>
-                          <pic:cNvPr id="0" name="Picture 13"/>
-                          <pic:cNvPicPr>
-                            <a:picLocks noChangeAspect="1" noChangeArrowheads="1"/>
-                          </pic:cNvPicPr>
+                          <pic:cNvPr id="1903709900" name=""/>
+                          <pic:cNvPicPr/>
                         </pic:nvPicPr>
                         <pic:blipFill>
-                          <a:blip r:embed="rId10">
-                            <a:extLst>
-                              <a:ext uri="{28A0092B-C50C-407E-A947-70E740481C1C}">
-                                <a14:useLocalDpi xmlns:a14="http://schemas.microsoft.com/office/drawing/2010/main" val="0"/>
-                              </a:ext>
-                            </a:extLst>
-                          </a:blip>
-                          <a:srcRect/>
+                          <a:blip r:embed="rId13"/>
+                          <a:stretch>
+                            <a:fillRect/>
+                          </a:stretch>
+                        </pic:blipFill>
+                        <pic:spPr>
+                          <a:xfrm>
+                            <a:off x="0" y="0"/>
+                            <a:ext cx="5700164" cy="2631895"/>
+                          </a:xfrm>
+                          <a:prstGeom prst="rect">
+                            <a:avLst/>
+                          </a:prstGeom>
+                        </pic:spPr>
+                      </pic:pic>
+                    </a:graphicData>
+                  </a:graphic>
+                </wp:inline>
+              </w:drawing>
+            </w:r>
+          </w:p>
+          <w:p>
+            <w:pPr>
+              <w:spacing w:after="120"/>
+              <w:rPr>
+                <w:sz w:val="24"/>
+                <w:szCs w:val="24"/>
+              </w:rPr>
+            </w:pPr>
+            <w:r>
+              <w:rPr>
+                <w:sz w:val="24"/>
+                <w:szCs w:val="24"/>
+              </w:rPr>
+              <w:lastRenderedPageBreak/>
+              <w:t xml:space="preserve">Prompt2: </w:t>
+            </w:r>
+            <w:r>
+              <w:rPr>
+                <w:sz w:val="24"/>
+                <w:szCs w:val="24"/>
+              </w:rPr>
+              <w:t>What were the main issues for the 2022 election?</w:t>
+            </w:r>
+          </w:p>
+          <w:p>
+            <w:pPr>
+              <w:spacing w:after="120"/>
+              <w:rPr>
+                <w:sz w:val="24"/>
+                <w:szCs w:val="24"/>
+              </w:rPr>
+            </w:pPr>
+            <w:r>
+              <w:rPr>
+                <w:sz w:val="24"/>
+                <w:szCs w:val="24"/>
+              </w:rPr>
+              <w:t>Response:</w:t>
+            </w:r>
+          </w:p>
+          <w:p>
+            <w:pPr>
+              <w:spacing w:after="120"/>
+              <w:rPr>
+                <w:sz w:val="24"/>
+                <w:szCs w:val="24"/>
+              </w:rPr>
+            </w:pPr>
+            <w:r>
+              <w:rPr>
+                <w:sz w:val="24"/>
+                <w:szCs w:val="24"/>
+              </w:rPr>
+              <w:t>The 2022 U.S. midterm elections were defined by a stark contrast in priorities between voters, driven largely by severe economic pressure on one side and major social/legal rulings on the other.</w:t>
+            </w:r>
+          </w:p>
+          <w:p>
+            <w:pPr>
+              <w:spacing w:after="120"/>
+              <w:rPr>
+                <w:sz w:val="24"/>
+                <w:szCs w:val="24"/>
+              </w:rPr>
+            </w:pPr>
+          </w:p>
+          <w:p>
+            <w:pPr>
+              <w:spacing w:after="120"/>
+              <w:rPr>
+                <w:sz w:val="24"/>
+                <w:szCs w:val="24"/>
+              </w:rPr>
+            </w:pPr>
+            <w:r>
+              <w:rPr>
+                <w:sz w:val="24"/>
+                <w:szCs w:val="24"/>
+              </w:rPr>
+              <w:pict w14:anchorId="6AD45B11">
+                <v:rect id="_x0000_i1061" style="width:0;height:1.5pt" o:hralign="center" o:hrstd="t" o:hrnoshade="t" o:hr="t" fillcolor="gray" stroked="f"/>
+              </w:pict>
+            </w:r>
+          </w:p>
+          <w:p>
+            <w:pPr>
+              <w:spacing w:after="120"/>
+              <w:rPr>
+                <w:b/>
+                <w:bCs/>
+                <w:sz w:val="24"/>
+                <w:szCs w:val="24"/>
+              </w:rPr>
+            </w:pPr>
+            <w:r>
+              <w:rPr>
+                <w:b/>
+                <w:bCs/>
+                <w:sz w:val="24"/>
+                <w:szCs w:val="24"/>
+              </w:rPr>
+              <w:t>1. Economy &amp; High Inflation</w:t>
+            </w:r>
+          </w:p>
+          <w:p>
+            <w:pPr>
+              <w:spacing w:after="120"/>
+              <w:rPr>
+                <w:sz w:val="24"/>
+                <w:szCs w:val="24"/>
+              </w:rPr>
+            </w:pPr>
+            <w:r>
+              <w:rPr>
+                <w:sz w:val="24"/>
+                <w:szCs w:val="24"/>
+              </w:rPr>
+              <w:t>The economy ranked as the top overall concern across major polling data.</w:t>
+            </w:r>
+          </w:p>
+          <w:p>
+            <w:pPr>
+              <w:spacing w:after="120"/>
+              <w:rPr>
+                <w:sz w:val="24"/>
+                <w:szCs w:val="24"/>
+              </w:rPr>
+            </w:pPr>
+            <w:r>
+              <w:rPr>
+                <w:sz w:val="24"/>
+                <w:szCs w:val="24"/>
+              </w:rPr>
+              <w:br/>
+            </w:r>
+          </w:p>
+          <w:p>
+            <w:pPr>
+              <w:numPr>
+                <w:ilvl w:val="0"/>
+                <w:numId w:val="12"/>
+              </w:numPr>
+              <w:spacing w:after="120"/>
+              <w:rPr>
+                <w:sz w:val="24"/>
+                <w:szCs w:val="24"/>
+              </w:rPr>
+            </w:pPr>
+            <w:r>
+              <w:rPr>
+                <w:b/>
+                <w:bCs/>
+                <w:sz w:val="24"/>
+                <w:szCs w:val="24"/>
+              </w:rPr>
+              <w:t>Inflation &amp; Cost of Living:</w:t>
+            </w:r>
+            <w:r>
+              <w:rPr>
+                <w:sz w:val="24"/>
+                <w:szCs w:val="24"/>
+              </w:rPr>
+              <w:t xml:space="preserve"> Escalating consumer prices for everyday necessities—such as groceries, housing, and gasoline—were the primary driver of voter concern.</w:t>
+            </w:r>
+          </w:p>
+          <w:p>
+            <w:pPr>
+              <w:spacing w:after="120"/>
+              <w:rPr>
+                <w:sz w:val="24"/>
+                <w:szCs w:val="24"/>
+              </w:rPr>
+            </w:pPr>
+          </w:p>
+          <w:p>
+            <w:pPr>
+              <w:numPr>
+                <w:ilvl w:val="0"/>
+                <w:numId w:val="12"/>
+              </w:numPr>
+              <w:spacing w:after="120"/>
+              <w:rPr>
+                <w:sz w:val="24"/>
+                <w:szCs w:val="24"/>
+              </w:rPr>
+            </w:pPr>
+            <w:r>
+              <w:rPr>
+                <w:b/>
+                <w:bCs/>
+                <w:sz w:val="24"/>
+                <w:szCs w:val="24"/>
+              </w:rPr>
+              <w:t>Impact:</w:t>
+            </w:r>
+            <w:r>
+              <w:rPr>
+                <w:sz w:val="24"/>
+                <w:szCs w:val="24"/>
+              </w:rPr>
+              <w:t xml:space="preserve"> Voters focused on the economy overwhelmingly leaned toward Republican candidates, holding the governing party accountable for post-pandemic price increases.</w:t>
+            </w:r>
+          </w:p>
+          <w:p>
+            <w:pPr>
+              <w:spacing w:after="120"/>
+              <w:rPr>
+                <w:sz w:val="24"/>
+                <w:szCs w:val="24"/>
+              </w:rPr>
+            </w:pPr>
+          </w:p>
+          <w:p>
+            <w:pPr>
+              <w:spacing w:after="120"/>
+              <w:rPr>
+                <w:sz w:val="24"/>
+                <w:szCs w:val="24"/>
+              </w:rPr>
+            </w:pPr>
+            <w:r>
+              <w:rPr>
+                <w:sz w:val="24"/>
+                <w:szCs w:val="24"/>
+              </w:rPr>
+              <w:pict w14:anchorId="6FB698FA">
+                <v:rect id="_x0000_i1062" style="width:0;height:1.5pt" o:hralign="center" o:hrstd="t" o:hrnoshade="t" o:hr="t" fillcolor="gray" stroked="f"/>
+              </w:pict>
+            </w:r>
+          </w:p>
+          <w:p>
+            <w:pPr>
+              <w:spacing w:after="120"/>
+              <w:rPr>
+                <w:b/>
+                <w:bCs/>
+                <w:sz w:val="24"/>
+                <w:szCs w:val="24"/>
+              </w:rPr>
+            </w:pPr>
+            <w:r>
+              <w:rPr>
+                <w:b/>
+                <w:bCs/>
+                <w:sz w:val="24"/>
+                <w:szCs w:val="24"/>
+              </w:rPr>
+              <w:t>2. Reproductive Rights &amp; Abortion</w:t>
+            </w:r>
+          </w:p>
+          <w:p>
+            <w:pPr>
+              <w:spacing w:after="120"/>
+              <w:rPr>
+                <w:sz w:val="24"/>
+                <w:szCs w:val="24"/>
+              </w:rPr>
+            </w:pPr>
+            <w:r>
+              <w:rPr>
+                <w:sz w:val="24"/>
+                <w:szCs w:val="24"/>
+              </w:rPr>
+              <w:t xml:space="preserve">Abortion surged to the forefront of national politics following the U.S. Supreme Court’s decision in </w:t>
+            </w:r>
+            <w:r>
+              <w:rPr>
+                <w:i/>
+                <w:iCs/>
+                <w:sz w:val="24"/>
+                <w:szCs w:val="24"/>
+              </w:rPr>
+              <w:t>Dobbs v. Jackson Women's Health Organization</w:t>
+            </w:r>
+            <w:r>
+              <w:rPr>
+                <w:sz w:val="24"/>
+                <w:szCs w:val="24"/>
+              </w:rPr>
+              <w:t xml:space="preserve"> (which overturned </w:t>
+            </w:r>
+            <w:r>
+              <w:rPr>
+                <w:i/>
+                <w:iCs/>
+                <w:sz w:val="24"/>
+                <w:szCs w:val="24"/>
+              </w:rPr>
+              <w:t>Roe v. Wade</w:t>
+            </w:r>
+            <w:r>
+              <w:rPr>
+                <w:sz w:val="24"/>
+                <w:szCs w:val="24"/>
+              </w:rPr>
+              <w:t>).</w:t>
+            </w:r>
+          </w:p>
+          <w:p>
+            <w:pPr>
+              <w:spacing w:after="120"/>
+              <w:rPr>
+                <w:sz w:val="24"/>
+                <w:szCs w:val="24"/>
+              </w:rPr>
+            </w:pPr>
+            <w:r>
+              <w:rPr>
+                <w:sz w:val="24"/>
+                <w:szCs w:val="24"/>
+              </w:rPr>
+              <w:br/>
+            </w:r>
+          </w:p>
+          <w:p>
+            <w:pPr>
+              <w:numPr>
+                <w:ilvl w:val="0"/>
+                <w:numId w:val="13"/>
+              </w:numPr>
+              <w:spacing w:after="120"/>
+              <w:rPr>
+                <w:sz w:val="24"/>
+                <w:szCs w:val="24"/>
+              </w:rPr>
+            </w:pPr>
+            <w:r>
+              <w:rPr>
+                <w:b/>
+                <w:bCs/>
+                <w:sz w:val="24"/>
+                <w:szCs w:val="24"/>
+              </w:rPr>
+              <w:t>Impact:</w:t>
+            </w:r>
+            <w:r>
+              <w:rPr>
+                <w:sz w:val="24"/>
+                <w:szCs w:val="24"/>
+              </w:rPr>
+              <w:t xml:space="preserve"> The issue served as a primary driver of turnout among Democratic-leaning voters, women, and younger demographics. Research indicated that views on abortion rights were a major factor in driving swing voters to support Democratic candidates, counteracting traditional midterm economic backlash.</w:t>
+            </w:r>
+          </w:p>
+          <w:p>
+            <w:pPr>
+              <w:spacing w:after="120"/>
+              <w:rPr>
+                <w:sz w:val="24"/>
+                <w:szCs w:val="24"/>
+              </w:rPr>
+            </w:pPr>
+          </w:p>
+          <w:p>
+            <w:pPr>
+              <w:spacing w:after="120"/>
+              <w:rPr>
+                <w:sz w:val="24"/>
+                <w:szCs w:val="24"/>
+              </w:rPr>
+            </w:pPr>
+            <w:r>
+              <w:rPr>
+                <w:sz w:val="24"/>
+                <w:szCs w:val="24"/>
+              </w:rPr>
+              <w:pict w14:anchorId="4B17AE20">
+                <v:rect id="_x0000_i1063" style="width:0;height:1.5pt" o:hralign="center" o:hrstd="t" o:hrnoshade="t" o:hr="t" fillcolor="gray" stroked="f"/>
+              </w:pict>
+            </w:r>
+          </w:p>
+          <w:p>
+            <w:pPr>
+              <w:spacing w:after="120"/>
+              <w:rPr>
+                <w:b/>
+                <w:bCs/>
+                <w:sz w:val="24"/>
+                <w:szCs w:val="24"/>
+              </w:rPr>
+            </w:pPr>
+            <w:r>
+              <w:rPr>
+                <w:b/>
+                <w:bCs/>
+                <w:sz w:val="24"/>
+                <w:szCs w:val="24"/>
+              </w:rPr>
+              <w:t>3. Preservation of Democracy</w:t>
+            </w:r>
+          </w:p>
+          <w:p>
+            <w:pPr>
+              <w:spacing w:after="120"/>
+              <w:rPr>
+                <w:sz w:val="24"/>
+                <w:szCs w:val="24"/>
+              </w:rPr>
+            </w:pPr>
+            <w:r>
+              <w:rPr>
+                <w:sz w:val="24"/>
+                <w:szCs w:val="24"/>
+              </w:rPr>
+              <w:lastRenderedPageBreak/>
+              <w:t>Voting rights, election integrity, and the overall stability of democratic institutions were central themes.</w:t>
+            </w:r>
+          </w:p>
+          <w:p>
+            <w:pPr>
+              <w:spacing w:after="120"/>
+              <w:rPr>
+                <w:sz w:val="24"/>
+                <w:szCs w:val="24"/>
+              </w:rPr>
+            </w:pPr>
+            <w:r>
+              <w:rPr>
+                <w:sz w:val="24"/>
+                <w:szCs w:val="24"/>
+              </w:rPr>
+              <w:br/>
+            </w:r>
+          </w:p>
+          <w:p>
+            <w:pPr>
+              <w:numPr>
+                <w:ilvl w:val="0"/>
+                <w:numId w:val="14"/>
+              </w:numPr>
+              <w:spacing w:after="120"/>
+              <w:rPr>
+                <w:sz w:val="24"/>
+                <w:szCs w:val="24"/>
+              </w:rPr>
+            </w:pPr>
+            <w:r>
+              <w:rPr>
+                <w:b/>
+                <w:bCs/>
+                <w:sz w:val="24"/>
+                <w:szCs w:val="24"/>
+              </w:rPr>
+              <w:t>Democrat Perspective:</w:t>
+            </w:r>
+            <w:r>
+              <w:rPr>
+                <w:sz w:val="24"/>
+                <w:szCs w:val="24"/>
+              </w:rPr>
+              <w:t xml:space="preserve"> Focused heavily on protecting voting access and counteracting claims regarding the legitimacy of the 2020 election.</w:t>
+            </w:r>
+          </w:p>
+          <w:p>
+            <w:pPr>
+              <w:spacing w:after="120"/>
+              <w:rPr>
+                <w:sz w:val="24"/>
+                <w:szCs w:val="24"/>
+              </w:rPr>
+            </w:pPr>
+          </w:p>
+          <w:p>
+            <w:pPr>
+              <w:numPr>
+                <w:ilvl w:val="0"/>
+                <w:numId w:val="14"/>
+              </w:numPr>
+              <w:spacing w:after="120"/>
+              <w:rPr>
+                <w:sz w:val="24"/>
+                <w:szCs w:val="24"/>
+              </w:rPr>
+            </w:pPr>
+            <w:r>
+              <w:rPr>
+                <w:b/>
+                <w:bCs/>
+                <w:sz w:val="24"/>
+                <w:szCs w:val="24"/>
+              </w:rPr>
+              <w:t>Republican Perspective:</w:t>
+            </w:r>
+            <w:r>
+              <w:rPr>
+                <w:sz w:val="24"/>
+                <w:szCs w:val="24"/>
+              </w:rPr>
+              <w:t xml:space="preserve"> Focused on tightening election security laws and expressing concern over electoral processes.</w:t>
+            </w:r>
+          </w:p>
+          <w:p>
+            <w:pPr>
+              <w:spacing w:after="120"/>
+              <w:rPr>
+                <w:sz w:val="24"/>
+                <w:szCs w:val="24"/>
+              </w:rPr>
+            </w:pPr>
+          </w:p>
+          <w:p>
+            <w:pPr>
+              <w:spacing w:after="120"/>
+              <w:rPr>
+                <w:sz w:val="24"/>
+                <w:szCs w:val="24"/>
+              </w:rPr>
+            </w:pPr>
+            <w:r>
+              <w:rPr>
+                <w:sz w:val="24"/>
+                <w:szCs w:val="24"/>
+              </w:rPr>
+              <w:pict w14:anchorId="667FCC7A">
+                <v:rect id="_x0000_i1064" style="width:0;height:1.5pt" o:hralign="center" o:hrstd="t" o:hrnoshade="t" o:hr="t" fillcolor="gray" stroked="f"/>
+              </w:pict>
+            </w:r>
+          </w:p>
+          <w:p>
+            <w:pPr>
+              <w:spacing w:after="120"/>
+              <w:rPr>
+                <w:b/>
+                <w:bCs/>
+                <w:sz w:val="24"/>
+                <w:szCs w:val="24"/>
+              </w:rPr>
+            </w:pPr>
+            <w:r>
+              <w:rPr>
+                <w:b/>
+                <w:bCs/>
+                <w:sz w:val="24"/>
+                <w:szCs w:val="24"/>
+              </w:rPr>
+              <w:t>4. Immigration &amp; Border Security</w:t>
+            </w:r>
+          </w:p>
+          <w:p>
+            <w:pPr>
+              <w:spacing w:after="120"/>
+              <w:rPr>
+                <w:sz w:val="24"/>
+                <w:szCs w:val="24"/>
+              </w:rPr>
+            </w:pPr>
+            <w:r>
+              <w:rPr>
+                <w:sz w:val="24"/>
+                <w:szCs w:val="24"/>
+              </w:rPr>
+              <w:t>Border enforcement and migrant policy remained high-priority issues, particularly among conservative voters. Republican campaigns highlighted rising encounters along the U.S. southern border to criticize the administration's border management.</w:t>
+            </w:r>
+          </w:p>
+          <w:p>
+            <w:pPr>
+              <w:spacing w:after="120"/>
+              <w:rPr>
+                <w:sz w:val="24"/>
+                <w:szCs w:val="24"/>
+              </w:rPr>
+            </w:pPr>
+          </w:p>
+          <w:p>
+            <w:pPr>
+              <w:spacing w:after="120"/>
+              <w:rPr>
+                <w:sz w:val="24"/>
+                <w:szCs w:val="24"/>
+              </w:rPr>
+            </w:pPr>
+            <w:r>
+              <w:rPr>
+                <w:sz w:val="24"/>
+                <w:szCs w:val="24"/>
+              </w:rPr>
+              <w:pict w14:anchorId="4FD44FC4">
+                <v:rect id="_x0000_i1065" style="width:0;height:1.5pt" o:hralign="center" o:hrstd="t" o:hrnoshade="t" o:hr="t" fillcolor="gray" stroked="f"/>
+              </w:pict>
+            </w:r>
+          </w:p>
+          <w:p>
+            <w:pPr>
+              <w:spacing w:after="120"/>
+              <w:rPr>
+                <w:b/>
+                <w:bCs/>
+                <w:sz w:val="24"/>
+                <w:szCs w:val="24"/>
+              </w:rPr>
+            </w:pPr>
+            <w:r>
+              <w:rPr>
+                <w:b/>
+                <w:bCs/>
+                <w:sz w:val="24"/>
+                <w:szCs w:val="24"/>
+              </w:rPr>
+              <w:t>5. Crime &amp; Public Safety</w:t>
+            </w:r>
+          </w:p>
+          <w:p>
+            <w:pPr>
+              <w:spacing w:after="120"/>
+              <w:rPr>
+                <w:sz w:val="24"/>
+                <w:szCs w:val="24"/>
+              </w:rPr>
+            </w:pPr>
+            <w:r>
+              <w:rPr>
+                <w:sz w:val="24"/>
+                <w:szCs w:val="24"/>
+              </w:rPr>
+              <w:t>Concerns over rising rates of violent crime and public safety in major metropolitan areas featured prominently in campaign messaging. Republicans frequently emphasized law-and-order policies, while Democrats focused on gun violence and regulation efforts.</w:t>
+            </w:r>
+          </w:p>
+          <w:p>
+            <w:pPr>
+              <w:spacing w:after="120"/>
+              <w:rPr>
+                <w:sz w:val="24"/>
+                <w:szCs w:val="24"/>
+              </w:rPr>
+            </w:pPr>
+          </w:p>
+          <w:p>
+            <w:pPr>
+              <w:spacing w:after="120"/>
+              <w:rPr>
+                <w:sz w:val="24"/>
+                <w:szCs w:val="24"/>
+              </w:rPr>
+            </w:pPr>
+            <w:r>
+              <w:rPr>
+                <w:sz w:val="24"/>
+                <w:szCs w:val="24"/>
+              </w:rPr>
+              <w:pict w14:anchorId="1F04FE2D">
+                <v:rect id="_x0000_i1066" style="width:0;height:1.5pt" o:hralign="center" o:hrstd="t" o:hrnoshade="t" o:hr="t" fillcolor="gray" stroked="f"/>
+              </w:pict>
+            </w:r>
+          </w:p>
+          <w:p>
+            <w:pPr>
+              <w:spacing w:after="120"/>
+              <w:rPr>
+                <w:b/>
+                <w:bCs/>
+                <w:sz w:val="24"/>
+                <w:szCs w:val="24"/>
+              </w:rPr>
+            </w:pPr>
+            <w:r>
+              <w:rPr>
+                <w:b/>
+                <w:bCs/>
+                <w:sz w:val="24"/>
+                <w:szCs w:val="24"/>
+              </w:rPr>
+              <w:t>6. Energy &amp; Climate Change</w:t>
+            </w:r>
+          </w:p>
+          <w:p>
+            <w:pPr>
+              <w:spacing w:after="120"/>
+              <w:rPr>
+                <w:sz w:val="24"/>
+                <w:szCs w:val="24"/>
+              </w:rPr>
+            </w:pPr>
+            <w:r>
+              <w:rPr>
+                <w:sz w:val="24"/>
+                <w:szCs w:val="24"/>
+              </w:rPr>
+              <w:t>Energy policy generated a sharp divide between the parties:</w:t>
+            </w:r>
+          </w:p>
+          <w:p>
+            <w:pPr>
+              <w:spacing w:after="120"/>
+              <w:rPr>
+                <w:sz w:val="24"/>
+                <w:szCs w:val="24"/>
+              </w:rPr>
+            </w:pPr>
+            <w:r>
+              <w:rPr>
+                <w:sz w:val="24"/>
+                <w:szCs w:val="24"/>
+              </w:rPr>
+              <w:br/>
+            </w:r>
+          </w:p>
+          <w:p>
+            <w:pPr>
+              <w:numPr>
+                <w:ilvl w:val="0"/>
+                <w:numId w:val="15"/>
+              </w:numPr>
+              <w:spacing w:after="120"/>
+              <w:rPr>
+                <w:sz w:val="24"/>
+                <w:szCs w:val="24"/>
+              </w:rPr>
+            </w:pPr>
+            <w:r>
+              <w:rPr>
+                <w:b/>
+                <w:bCs/>
+                <w:sz w:val="24"/>
+                <w:szCs w:val="24"/>
+              </w:rPr>
+              <w:t>Energy Costs:</w:t>
+            </w:r>
+            <w:r>
+              <w:rPr>
+                <w:sz w:val="24"/>
+                <w:szCs w:val="24"/>
+              </w:rPr>
+              <w:t xml:space="preserve"> Republicans urged increased domestic fossil fuel production to lower gas prices.</w:t>
+            </w:r>
+          </w:p>
+          <w:p>
+            <w:pPr>
+              <w:spacing w:after="120"/>
+              <w:rPr>
+                <w:sz w:val="24"/>
+                <w:szCs w:val="24"/>
+              </w:rPr>
+            </w:pPr>
+          </w:p>
+          <w:p>
+            <w:pPr>
+              <w:numPr>
+                <w:ilvl w:val="0"/>
+                <w:numId w:val="15"/>
+              </w:numPr>
+              <w:spacing w:after="120"/>
+              <w:rPr>
+                <w:sz w:val="24"/>
+                <w:szCs w:val="24"/>
+              </w:rPr>
+            </w:pPr>
+            <w:r>
+              <w:rPr>
+                <w:b/>
+                <w:bCs/>
+                <w:sz w:val="24"/>
+                <w:szCs w:val="24"/>
+              </w:rPr>
+              <w:lastRenderedPageBreak/>
+              <w:t>Climate Action:</w:t>
+            </w:r>
+            <w:r>
+              <w:rPr>
+                <w:sz w:val="24"/>
+                <w:szCs w:val="24"/>
+              </w:rPr>
+              <w:t xml:space="preserve"> Democrats prioritized renewable energy investments and addressing global climate change.</w:t>
+            </w:r>
+          </w:p>
+          <w:p>
+            <w:pPr>
+              <w:spacing w:after="120"/>
+              <w:rPr>
+                <w:sz w:val="24"/>
+                <w:szCs w:val="24"/>
+              </w:rPr>
+            </w:pPr>
+            <w:r>
+              <w:rPr>
+                <w:sz w:val="24"/>
+                <w:szCs w:val="24"/>
+              </w:rPr>
+              <w:drawing>
+                <wp:inline distT="0" distB="0" distL="0" distR="0" wp14:anchorId="26E91C07" wp14:editId="1E09607C">
+                  <wp:extent cx="5286271" cy="4743450"/>
+                  <wp:effectExtent l="0" t="0" r="0" b="0"/>
+                  <wp:docPr id="101649596" name="Picture 1"/>
+                  <wp:cNvGraphicFramePr>
+                    <a:graphicFrameLocks xmlns:a="http://schemas.openxmlformats.org/drawingml/2006/main" noChangeAspect="1"/>
+                  </wp:cNvGraphicFramePr>
+                  <a:graphic xmlns:a="http://schemas.openxmlformats.org/drawingml/2006/main">
+                    <a:graphicData uri="http://schemas.openxmlformats.org/drawingml/2006/picture">
+                      <pic:pic xmlns:pic="http://schemas.openxmlformats.org/drawingml/2006/picture">
+                        <pic:nvPicPr>
+                          <pic:cNvPr id="101649596" name=""/>
+                          <pic:cNvPicPr/>
+                        </pic:nvPicPr>
+                        <pic:blipFill rotWithShape="1">
+                          <a:blip r:embed="rId14"/>
+                          <a:srcRect b="13692"/>
                           <a:stretch>
                             <a:fillRect/>
                           </a:stretch>
@@ -1228,15 +2181,19 @@
                         <pic:spPr bwMode="auto">
                           <a:xfrm>
                             <a:off x="0" y="0"/>
-                            <a:ext cx="6263640" cy="1737995"/>
+                            <a:ext cx="5293595" cy="4750022"/>
                           </a:xfrm>
                           <a:prstGeom prst="rect">
                             <a:avLst/>
                           </a:prstGeom>
-                          <a:noFill/>
                           <a:ln>
                             <a:noFill/>
                           </a:ln>
+                          <a:extLst>
+                            <a:ext uri="{53640926-AAD7-44D8-BBD7-CCE9431645EC}">
+                              <a14:shadowObscured xmlns:a14="http://schemas.microsoft.com/office/drawing/2010/main"/>
+                            </a:ext>
+                          </a:extLst>
                         </pic:spPr>
                       </pic:pic>
                     </a:graphicData>
@@ -1253,6 +2210,48 @@
                 <w:szCs w:val="24"/>
               </w:rPr>
             </w:pPr>
+            <w:r>
+              <w:rPr>
+                <w:sz w:val="24"/>
+                <w:szCs w:val="24"/>
+              </w:rPr>
+              <w:lastRenderedPageBreak/>
+              <w:drawing>
+                <wp:inline distT="0" distB="0" distL="0" distR="0" wp14:anchorId="00471A6E" wp14:editId="5CF79A92">
+                  <wp:extent cx="5867400" cy="6669157"/>
+                  <wp:effectExtent l="0" t="0" r="0" b="0"/>
+                  <wp:docPr id="1965897159" name="Picture 1"/>
+                  <wp:cNvGraphicFramePr>
+                    <a:graphicFrameLocks xmlns:a="http://schemas.openxmlformats.org/drawingml/2006/main" noChangeAspect="1"/>
+                  </wp:cNvGraphicFramePr>
+                  <a:graphic xmlns:a="http://schemas.openxmlformats.org/drawingml/2006/main">
+                    <a:graphicData uri="http://schemas.openxmlformats.org/drawingml/2006/picture">
+                      <pic:pic xmlns:pic="http://schemas.openxmlformats.org/drawingml/2006/picture">
+                        <pic:nvPicPr>
+                          <pic:cNvPr id="1965897159" name=""/>
+                          <pic:cNvPicPr/>
+                        </pic:nvPicPr>
+                        <pic:blipFill>
+                          <a:blip r:embed="rId15"/>
+                          <a:stretch>
+                            <a:fillRect/>
+                          </a:stretch>
+                        </pic:blipFill>
+                        <pic:spPr>
+                          <a:xfrm>
+                            <a:off x="0" y="0"/>
+                            <a:ext cx="5877913" cy="6681107"/>
+                          </a:xfrm>
+                          <a:prstGeom prst="rect">
+                            <a:avLst/>
+                          </a:prstGeom>
+                        </pic:spPr>
+                      </pic:pic>
+                    </a:graphicData>
+                  </a:graphic>
+                </wp:inline>
+              </w:drawing>
+            </w:r>
           </w:p>
           <w:p>
             <w:pPr>
@@ -1449,45 +2448,61 @@
                 <w:sz w:val="24"/>
                 <w:szCs w:val="24"/>
               </w:rPr>
-              <w:lastRenderedPageBreak/>
-              <w:t>Domain Specific Question which was not answered correctly. This is an example of Knowledge Gap</w:t>
-            </w:r>
-          </w:p>
-          <w:p>
-            <w:pPr>
-              <w:rPr>
-                <w:sz w:val="24"/>
-                <w:szCs w:val="24"/>
-              </w:rPr>
-            </w:pPr>
-            <w:r>
-              <w:rPr>
-                <w:sz w:val="24"/>
-                <w:szCs w:val="24"/>
-              </w:rPr>
-              <w:t>Prompt</w:t>
-            </w:r>
-            <w:r>
-              <w:rPr>
-                <w:sz w:val="24"/>
-                <w:szCs w:val="24"/>
-              </w:rPr>
-              <w:t>:</w:t>
-            </w:r>
-          </w:p>
-          <w:p>
-            <w:pPr>
-              <w:rPr>
-                <w:sz w:val="24"/>
-                <w:szCs w:val="24"/>
-              </w:rPr>
-            </w:pPr>
-            <w:r>
-              <w:rPr>
-                <w:sz w:val="24"/>
-                <w:szCs w:val="24"/>
-              </w:rPr>
-              <w:t>What is the difference between claim and encounter in Healthcare Payer domain?</w:t>
+              <w:t>P</w:t>
+            </w:r>
+            <w:r>
+              <w:rPr>
+                <w:sz w:val="24"/>
+                <w:szCs w:val="24"/>
+              </w:rPr>
+              <w:t xml:space="preserve">rompt: When did Howdy Modi </w:t>
+            </w:r>
+            <w:proofErr w:type="spellStart"/>
+            <w:r>
+              <w:rPr>
+                <w:sz w:val="24"/>
+                <w:szCs w:val="24"/>
+              </w:rPr>
+              <w:t>happend</w:t>
+            </w:r>
+            <w:proofErr w:type="spellEnd"/>
+            <w:r>
+              <w:rPr>
+                <w:sz w:val="24"/>
+                <w:szCs w:val="24"/>
+              </w:rPr>
+              <w:t xml:space="preserve"> in </w:t>
+            </w:r>
+            <w:proofErr w:type="spellStart"/>
+            <w:r>
+              <w:rPr>
+                <w:sz w:val="24"/>
+                <w:szCs w:val="24"/>
+              </w:rPr>
+              <w:t>Taxas</w:t>
+            </w:r>
+            <w:proofErr w:type="spellEnd"/>
+            <w:r>
+              <w:rPr>
+                <w:sz w:val="24"/>
+                <w:szCs w:val="24"/>
+              </w:rPr>
+              <w:t>?</w:t>
+            </w:r>
+          </w:p>
+          <w:p>
+            <w:pPr>
+              <w:rPr>
+                <w:sz w:val="24"/>
+                <w:szCs w:val="24"/>
+              </w:rPr>
+            </w:pPr>
+            <w:r>
+              <w:rPr>
+                <w:sz w:val="24"/>
+                <w:szCs w:val="24"/>
+              </w:rPr>
+              <w:t>Assistant: The provided articles do not contain information about "Howdy Modi" in Texas. Therefore, I cannot answer your question.</w:t>
             </w:r>
           </w:p>
           <w:p>
@@ -1500,14 +2515,12 @@
             <w:r>
               <w:rPr>
                 <w:noProof/>
-                <w:sz w:val="24"/>
-                <w:szCs w:val="24"/>
               </w:rPr>
               <w:drawing>
-                <wp:inline distT="0" distB="0" distL="0" distR="0" wp14:anchorId="3D0A25EC" wp14:editId="31987652">
-                  <wp:extent cx="6263640" cy="973455"/>
-                  <wp:effectExtent l="0" t="0" r="3810" b="0"/>
-                  <wp:docPr id="1669531037" name="Picture 8"/>
+                <wp:inline distT="0" distB="0" distL="0" distR="0" wp14:anchorId="1037CF47" wp14:editId="7D7971B8">
+                  <wp:extent cx="6286500" cy="476250"/>
+                  <wp:effectExtent l="0" t="0" r="0" b="0"/>
+                  <wp:docPr id="1613466686" name="Picture 1"/>
                   <wp:cNvGraphicFramePr>
                     <a:graphicFrameLocks xmlns:a="http://schemas.openxmlformats.org/drawingml/2006/main" noChangeAspect="1"/>
                   </wp:cNvGraphicFramePr>
@@ -1515,36 +2528,23 @@
                     <a:graphicData uri="http://schemas.openxmlformats.org/drawingml/2006/picture">
                       <pic:pic xmlns:pic="http://schemas.openxmlformats.org/drawingml/2006/picture">
                         <pic:nvPicPr>
-                          <pic:cNvPr id="0" name="Picture 20"/>
-                          <pic:cNvPicPr>
-                            <a:picLocks noChangeAspect="1" noChangeArrowheads="1"/>
-                          </pic:cNvPicPr>
+                          <pic:cNvPr id="1613466686" name=""/>
+                          <pic:cNvPicPr/>
                         </pic:nvPicPr>
                         <pic:blipFill>
-                          <a:blip r:embed="rId11" cstate="print">
-                            <a:extLst>
-                              <a:ext uri="{28A0092B-C50C-407E-A947-70E740481C1C}">
-                                <a14:useLocalDpi xmlns:a14="http://schemas.microsoft.com/office/drawing/2010/main" val="0"/>
-                              </a:ext>
-                            </a:extLst>
-                          </a:blip>
-                          <a:srcRect/>
+                          <a:blip r:embed="rId16"/>
                           <a:stretch>
                             <a:fillRect/>
                           </a:stretch>
                         </pic:blipFill>
-                        <pic:spPr bwMode="auto">
+                        <pic:spPr>
                           <a:xfrm>
                             <a:off x="0" y="0"/>
-                            <a:ext cx="6263640" cy="973455"/>
+                            <a:ext cx="6286598" cy="476257"/>
                           </a:xfrm>
                           <a:prstGeom prst="rect">
                             <a:avLst/>
                           </a:prstGeom>
-                          <a:noFill/>
-                          <a:ln>
-                            <a:noFill/>
-                          </a:ln>
                         </pic:spPr>
                       </pic:pic>
                     </a:graphicData>
@@ -1555,81 +2555,94 @@
           </w:p>
           <w:p>
             <w:pPr>
-              <w:rPr>
+              <w:spacing w:after="120"/>
+              <w:rPr>
+                <w:rFonts w:eastAsia="Aptos"/>
+                <w:color w:val="000000"/>
+                <w:sz w:val="24"/>
+                <w:szCs w:val="24"/>
+              </w:rPr>
+            </w:pPr>
+            <w:r>
+              <w:rPr>
+                <w:rFonts w:eastAsia="Aptos"/>
                 <w:b/>
                 <w:bCs/>
-              </w:rPr>
-            </w:pPr>
-            <w:r>
-              <w:rPr>
+                <w:color w:val="000000"/>
+                <w:sz w:val="24"/>
+                <w:szCs w:val="24"/>
+              </w:rPr>
+              <w:t>S</w:t>
+            </w:r>
+            <w:r>
+              <w:rPr>
+                <w:rFonts w:eastAsia="Aptos"/>
                 <w:b/>
                 <w:bCs/>
-              </w:rPr>
-              <w:t>State Info</w:t>
-            </w:r>
-            <w:r>
-              <w:rPr>
-                <w:b/>
-                <w:bCs/>
-              </w:rPr>
-              <w:t>r</w:t>
-            </w:r>
-            <w:r>
-              <w:rPr>
-                <w:b/>
-                <w:bCs/>
-              </w:rPr>
-              <w:t>mation</w:t>
-            </w:r>
-          </w:p>
-          <w:p>
-            <w:pPr>
-              <w:rPr>
-                <w:sz w:val="24"/>
-                <w:szCs w:val="24"/>
-              </w:rPr>
-            </w:pPr>
-            <w:r>
-              <w:rPr>
-                <w:sz w:val="24"/>
-                <w:szCs w:val="24"/>
-              </w:rPr>
-              <w:t>Prompt: what is the current situation on the strait of hormuz?</w:t>
-            </w:r>
-          </w:p>
-          <w:p>
-            <w:pPr>
-              <w:rPr>
-                <w:sz w:val="24"/>
-                <w:szCs w:val="24"/>
-              </w:rPr>
-            </w:pPr>
-            <w:r>
-              <w:rPr>
-                <w:sz w:val="24"/>
-                <w:szCs w:val="24"/>
-              </w:rPr>
-              <w:t>It answered what was the state back in October 2023. may be it is not current because of some political reasons</w:t>
-            </w:r>
-          </w:p>
-          <w:p>
-            <w:pPr>
-              <w:rPr>
-                <w:sz w:val="24"/>
-                <w:szCs w:val="24"/>
-              </w:rPr>
-            </w:pPr>
-            <w:r>
-              <w:rPr>
-                <w:noProof/>
+                <w:color w:val="000000"/>
+                <w:sz w:val="24"/>
+                <w:szCs w:val="24"/>
+              </w:rPr>
+              <w:t>tale information</w:t>
+            </w:r>
+          </w:p>
+          <w:p>
+            <w:pPr>
+              <w:spacing w:after="120"/>
+              <w:rPr>
+                <w:sz w:val="24"/>
+                <w:szCs w:val="24"/>
+              </w:rPr>
+            </w:pPr>
+            <w:r>
+              <w:rPr>
+                <w:sz w:val="24"/>
+                <w:szCs w:val="24"/>
+              </w:rPr>
+              <w:t>Prompt</w:t>
+            </w:r>
+            <w:r>
+              <w:rPr>
+                <w:sz w:val="24"/>
+                <w:szCs w:val="24"/>
+              </w:rPr>
+              <w:t>: Is Joe Biden still incumbent?</w:t>
+            </w:r>
+          </w:p>
+          <w:p>
+            <w:pPr>
+              <w:spacing w:after="120"/>
+              <w:rPr>
+                <w:sz w:val="24"/>
+                <w:szCs w:val="24"/>
+              </w:rPr>
+            </w:pPr>
+            <w:r>
+              <w:rPr>
+                <w:sz w:val="24"/>
+                <w:szCs w:val="24"/>
+              </w:rPr>
+              <w:t>Assistant: Yes, Joe Biden is still the incumbent president as of the 2022 United States elections. He is a Democrat who has served since his inauguration. The elections took place on November 8, 2022, during his term. (Source: 2022_US_elections.txt)</w:t>
+            </w:r>
+          </w:p>
+          <w:p>
+            <w:pPr>
+              <w:spacing w:after="120"/>
+              <w:rPr>
+                <w:sz w:val="24"/>
+                <w:szCs w:val="24"/>
+              </w:rPr>
+            </w:pPr>
+            <w:r>
+              <w:rPr>
                 <w:sz w:val="24"/>
                 <w:szCs w:val="24"/>
               </w:rPr>
               <w:drawing>
-                <wp:inline distT="0" distB="0" distL="0" distR="0" wp14:anchorId="42512491" wp14:editId="12430EB8">
-                  <wp:extent cx="6263640" cy="719455"/>
-                  <wp:effectExtent l="0" t="0" r="3810" b="4445"/>
-                  <wp:docPr id="1818442669" name="Picture 10"/>
+                <wp:inline distT="0" distB="0" distL="0" distR="0" wp14:anchorId="549FEAD9" wp14:editId="160156EF">
+                  <wp:extent cx="6263640" cy="521335"/>
+                  <wp:effectExtent l="0" t="0" r="3810" b="0"/>
+                  <wp:docPr id="226498734" name="Picture 1"/>
                   <wp:cNvGraphicFramePr>
                     <a:graphicFrameLocks xmlns:a="http://schemas.openxmlformats.org/drawingml/2006/main" noChangeAspect="1"/>
                   </wp:cNvGraphicFramePr>
@@ -1637,36 +2650,23 @@
                     <a:graphicData uri="http://schemas.openxmlformats.org/drawingml/2006/picture">
                       <pic:pic xmlns:pic="http://schemas.openxmlformats.org/drawingml/2006/picture">
                         <pic:nvPicPr>
-                          <pic:cNvPr id="0" name="Picture 27"/>
-                          <pic:cNvPicPr>
-                            <a:picLocks noChangeAspect="1" noChangeArrowheads="1"/>
-                          </pic:cNvPicPr>
+                          <pic:cNvPr id="226498734" name=""/>
+                          <pic:cNvPicPr/>
                         </pic:nvPicPr>
                         <pic:blipFill>
-                          <a:blip r:embed="rId12" cstate="print">
-                            <a:extLst>
-                              <a:ext uri="{28A0092B-C50C-407E-A947-70E740481C1C}">
-                                <a14:useLocalDpi xmlns:a14="http://schemas.microsoft.com/office/drawing/2010/main" val="0"/>
-                              </a:ext>
-                            </a:extLst>
-                          </a:blip>
-                          <a:srcRect/>
+                          <a:blip r:embed="rId17"/>
                           <a:stretch>
                             <a:fillRect/>
                           </a:stretch>
                         </pic:blipFill>
-                        <pic:spPr bwMode="auto">
+                        <pic:spPr>
                           <a:xfrm>
                             <a:off x="0" y="0"/>
-                            <a:ext cx="6263640" cy="719455"/>
+                            <a:ext cx="6263640" cy="521335"/>
                           </a:xfrm>
                           <a:prstGeom prst="rect">
                             <a:avLst/>
                           </a:prstGeom>
-                          <a:noFill/>
-                          <a:ln>
-                            <a:noFill/>
-                          </a:ln>
                         </pic:spPr>
                       </pic:pic>
                     </a:graphicData>
@@ -1675,140 +2675,6 @@
               </w:drawing>
             </w:r>
           </w:p>
-          <w:p>
-            <w:pPr>
-              <w:rPr>
-                <w:rFonts w:eastAsia="Aptos"/>
-                <w:color w:val="000000"/>
-                <w:sz w:val="24"/>
-                <w:szCs w:val="24"/>
-              </w:rPr>
-            </w:pPr>
-            <w:r>
-              <w:rPr>
-                <w:b/>
-                <w:bCs/>
-              </w:rPr>
-              <w:t>H</w:t>
-            </w:r>
-            <w:r>
-              <w:rPr>
-                <w:b/>
-                <w:bCs/>
-              </w:rPr>
-              <w:t>allucinations</w:t>
-            </w:r>
-            <w:r>
-              <w:rPr>
-                <w:rFonts w:eastAsia="Aptos"/>
-                <w:color w:val="000000"/>
-                <w:sz w:val="24"/>
-                <w:szCs w:val="24"/>
-              </w:rPr>
-              <w:t xml:space="preserve"> </w:t>
-            </w:r>
-          </w:p>
-          <w:p>
-            <w:r>
-              <w:t>Prompt: I am getting an error in Momentum-'Bump is identified, Owner's approval is required'. Do you know how to fix it?</w:t>
-            </w:r>
-          </w:p>
-          <w:p>
-            <w:pPr>
-              <w:rPr>
-                <w:sz w:val="24"/>
-                <w:szCs w:val="24"/>
-              </w:rPr>
-            </w:pPr>
-            <w:r>
-              <w:rPr>
-                <w:sz w:val="24"/>
-                <w:szCs w:val="24"/>
-              </w:rPr>
-              <w:t>I asked a question on proprietary framework called Momentum. I got a answer which is not related, it sounds like more based on common sense and a guess.</w:t>
-            </w:r>
-          </w:p>
-          <w:p>
-            <w:pPr>
-              <w:rPr>
-                <w:sz w:val="24"/>
-                <w:szCs w:val="24"/>
-              </w:rPr>
-            </w:pPr>
-            <w:r>
-              <w:rPr>
-                <w:noProof/>
-                <w:sz w:val="24"/>
-                <w:szCs w:val="24"/>
-              </w:rPr>
-              <w:drawing>
-                <wp:inline distT="0" distB="0" distL="0" distR="0" wp14:anchorId="6D0DEAF9" wp14:editId="01FB22B7">
-                  <wp:extent cx="6263640" cy="1280160"/>
-                  <wp:effectExtent l="0" t="0" r="3810" b="0"/>
-                  <wp:docPr id="1936380518" name="Picture 12"/>
-                  <wp:cNvGraphicFramePr>
-                    <a:graphicFrameLocks xmlns:a="http://schemas.openxmlformats.org/drawingml/2006/main" noChangeAspect="1"/>
-                  </wp:cNvGraphicFramePr>
-                  <a:graphic xmlns:a="http://schemas.openxmlformats.org/drawingml/2006/main">
-                    <a:graphicData uri="http://schemas.openxmlformats.org/drawingml/2006/picture">
-                      <pic:pic xmlns:pic="http://schemas.openxmlformats.org/drawingml/2006/picture">
-                        <pic:nvPicPr>
-                          <pic:cNvPr id="0" name="Picture 34"/>
-                          <pic:cNvPicPr>
-                            <a:picLocks noChangeAspect="1" noChangeArrowheads="1"/>
-                          </pic:cNvPicPr>
-                        </pic:nvPicPr>
-                        <pic:blipFill>
-                          <a:blip r:embed="rId13">
-                            <a:extLst>
-                              <a:ext uri="{28A0092B-C50C-407E-A947-70E740481C1C}">
-                                <a14:useLocalDpi xmlns:a14="http://schemas.microsoft.com/office/drawing/2010/main" val="0"/>
-                              </a:ext>
-                            </a:extLst>
-                          </a:blip>
-                          <a:srcRect/>
-                          <a:stretch>
-                            <a:fillRect/>
-                          </a:stretch>
-                        </pic:blipFill>
-                        <pic:spPr bwMode="auto">
-                          <a:xfrm>
-                            <a:off x="0" y="0"/>
-                            <a:ext cx="6263640" cy="1280160"/>
-                          </a:xfrm>
-                          <a:prstGeom prst="rect">
-                            <a:avLst/>
-                          </a:prstGeom>
-                          <a:noFill/>
-                          <a:ln>
-                            <a:noFill/>
-                          </a:ln>
-                        </pic:spPr>
-                      </pic:pic>
-                    </a:graphicData>
-                  </a:graphic>
-                </wp:inline>
-              </w:drawing>
-            </w:r>
-          </w:p>
-          <w:p>
-            <w:pPr>
-              <w:spacing w:after="120"/>
-              <w:rPr>
-                <w:sz w:val="24"/>
-                <w:szCs w:val="24"/>
-              </w:rPr>
-            </w:pPr>
-          </w:p>
-          <w:p>
-            <w:pPr>
-              <w:spacing w:after="120"/>
-              <w:rPr>
-                <w:sz w:val="24"/>
-                <w:szCs w:val="24"/>
-              </w:rPr>
-            </w:pPr>
-          </w:p>
         </w:tc>
       </w:tr>
     </w:tbl>
@@ -1818,7 +2684,6 @@
         <w:pStyle w:val="Heading1"/>
       </w:pPr>
       <w:r>
-        <w:lastRenderedPageBreak/>
         <w:t xml:space="preserve">4. </w:t>
       </w:r>
       <w:r>
@@ -1947,38 +2812,106 @@
           </w:tcPr>
           <w:p>
             <w:pPr>
-              <w:rPr>
-                <w:sz w:val="24"/>
-                <w:szCs w:val="24"/>
-              </w:rPr>
-            </w:pPr>
-            <w:r>
-              <w:rPr>
-                <w:sz w:val="24"/>
-                <w:szCs w:val="24"/>
-              </w:rPr>
-              <w:t>Response:</w:t>
-            </w:r>
-            <w:r>
-              <w:rPr>
-                <w:sz w:val="24"/>
-                <w:szCs w:val="24"/>
-              </w:rPr>
-              <w:t xml:space="preserve"> I have observed a pattern with keyword based search using </w:t>
-            </w:r>
-            <w:r>
-              <w:rPr>
-                <w:sz w:val="24"/>
-                <w:szCs w:val="24"/>
-              </w:rPr>
-              <w:t>bm25</w:t>
-            </w:r>
-            <w:r>
-              <w:rPr>
-                <w:sz w:val="24"/>
-                <w:szCs w:val="24"/>
-              </w:rPr>
-              <w:t>. It could answer correctly when used abbreviation for CEO and COO.  But on follow up question it answered wrong on datetime stamp for follow up email sent by COO, it took first unrelated follow up email’s date time and ignored the context.</w:t>
+              <w:spacing w:after="120"/>
+              <w:rPr>
+                <w:sz w:val="24"/>
+                <w:szCs w:val="24"/>
+              </w:rPr>
+            </w:pPr>
+            <w:r>
+              <w:rPr>
+                <w:b/>
+                <w:bCs/>
+                <w:sz w:val="24"/>
+                <w:szCs w:val="24"/>
+              </w:rPr>
+              <w:t xml:space="preserve">Limitation- </w:t>
+            </w:r>
+            <w:r>
+              <w:rPr>
+                <w:sz w:val="24"/>
+                <w:szCs w:val="24"/>
+              </w:rPr>
+              <w:t xml:space="preserve">in previous prompts it has given the top reasons for election. But when I am paraphrasing and using references, it is not able to find the answer. Bm25 is able to answer when it is finding matching or </w:t>
+            </w:r>
+            <w:proofErr w:type="spellStart"/>
+            <w:r>
+              <w:rPr>
+                <w:sz w:val="24"/>
+                <w:szCs w:val="24"/>
+              </w:rPr>
+              <w:t>some what</w:t>
+            </w:r>
+            <w:proofErr w:type="spellEnd"/>
+            <w:r>
+              <w:rPr>
+                <w:sz w:val="24"/>
+                <w:szCs w:val="24"/>
+              </w:rPr>
+              <w:t xml:space="preserve"> related references.</w:t>
+            </w:r>
+          </w:p>
+          <w:p>
+            <w:pPr>
+              <w:spacing w:after="120"/>
+              <w:rPr>
+                <w:sz w:val="24"/>
+                <w:szCs w:val="24"/>
+              </w:rPr>
+            </w:pPr>
+            <w:r>
+              <w:rPr>
+                <w:sz w:val="24"/>
+                <w:szCs w:val="24"/>
+              </w:rPr>
+              <w:lastRenderedPageBreak/>
+              <w:t> </w:t>
+            </w:r>
+          </w:p>
+          <w:p>
+            <w:pPr>
+              <w:spacing w:after="120"/>
+              <w:rPr>
+                <w:sz w:val="24"/>
+                <w:szCs w:val="24"/>
+              </w:rPr>
+            </w:pPr>
+            <w:r>
+              <w:rPr>
+                <w:sz w:val="24"/>
+                <w:szCs w:val="24"/>
+              </w:rPr>
+              <w:t>You: can you please help me find top 3 reasons those made Donal</w:t>
+            </w:r>
+            <w:r>
+              <w:rPr>
+                <w:sz w:val="24"/>
+                <w:szCs w:val="24"/>
+              </w:rPr>
+              <w:t>d</w:t>
+            </w:r>
+            <w:r>
+              <w:rPr>
+                <w:sz w:val="24"/>
+                <w:szCs w:val="24"/>
+              </w:rPr>
+              <w:t xml:space="preserve"> Trump win?</w:t>
+            </w:r>
+          </w:p>
+          <w:p>
+            <w:pPr>
+              <w:spacing w:after="120"/>
+              <w:rPr>
+                <w:sz w:val="24"/>
+                <w:szCs w:val="24"/>
+              </w:rPr>
+            </w:pPr>
+            <w:r>
+              <w:rPr>
+                <w:sz w:val="24"/>
+                <w:szCs w:val="24"/>
+              </w:rPr>
+              <w:t>Assistant: The provided articles do not contain information regarding Donald Trump's victories or reasons for winning in any elections. They primarily focus on the 2022 United States elections, detailing the outcomes, issues, and factors that influenced those elections, particularly regarding the Democratic and Republican parties. Therefore, I cannot provide an answer to your question.</w:t>
             </w:r>
           </w:p>
           <w:p>
@@ -1995,10 +2928,10 @@
                 <w:szCs w:val="24"/>
               </w:rPr>
               <w:drawing>
-                <wp:inline distT="0" distB="0" distL="0" distR="0" wp14:anchorId="0F5DFB16" wp14:editId="23762D59">
-                  <wp:extent cx="6263640" cy="2072005"/>
-                  <wp:effectExtent l="0" t="0" r="3810" b="4445"/>
-                  <wp:docPr id="1787598606" name="Picture 1"/>
+                <wp:inline distT="0" distB="0" distL="0" distR="0" wp14:anchorId="63BBC02C" wp14:editId="521CCC85">
+                  <wp:extent cx="6263640" cy="375285"/>
+                  <wp:effectExtent l="0" t="0" r="3810" b="5715"/>
+                  <wp:docPr id="1840906814" name="Picture 5"/>
                   <wp:cNvGraphicFramePr>
                     <a:graphicFrameLocks xmlns:a="http://schemas.openxmlformats.org/drawingml/2006/main" noChangeAspect="1"/>
                   </wp:cNvGraphicFramePr>
@@ -2006,23 +2939,36 @@
                     <a:graphicData uri="http://schemas.openxmlformats.org/drawingml/2006/picture">
                       <pic:pic xmlns:pic="http://schemas.openxmlformats.org/drawingml/2006/picture">
                         <pic:nvPicPr>
-                          <pic:cNvPr id="1787598606" name=""/>
-                          <pic:cNvPicPr/>
+                          <pic:cNvPr id="0" name="Picture 70"/>
+                          <pic:cNvPicPr>
+                            <a:picLocks noChangeAspect="1" noChangeArrowheads="1"/>
+                          </pic:cNvPicPr>
                         </pic:nvPicPr>
                         <pic:blipFill>
-                          <a:blip r:embed="rId14"/>
+                          <a:blip r:embed="rId18">
+                            <a:extLst>
+                              <a:ext uri="{28A0092B-C50C-407E-A947-70E740481C1C}">
+                                <a14:useLocalDpi xmlns:a14="http://schemas.microsoft.com/office/drawing/2010/main" val="0"/>
+                              </a:ext>
+                            </a:extLst>
+                          </a:blip>
+                          <a:srcRect/>
                           <a:stretch>
                             <a:fillRect/>
                           </a:stretch>
                         </pic:blipFill>
-                        <pic:spPr>
+                        <pic:spPr bwMode="auto">
                           <a:xfrm>
                             <a:off x="0" y="0"/>
-                            <a:ext cx="6263640" cy="2072005"/>
+                            <a:ext cx="6263640" cy="375285"/>
                           </a:xfrm>
                           <a:prstGeom prst="rect">
                             <a:avLst/>
                           </a:prstGeom>
+                          <a:noFill/>
+                          <a:ln>
+                            <a:noFill/>
+                          </a:ln>
                         </pic:spPr>
                       </pic:pic>
                     </a:graphicData>
@@ -2044,44 +2990,8 @@
                 <w:sz w:val="24"/>
                 <w:szCs w:val="24"/>
               </w:rPr>
-              <w:t>Bm25 seems reliable for non contextual prompt, for simple context it worked but for little more complex context, it answered based on first matched result</w:t>
-            </w:r>
-          </w:p>
-          <w:p>
-            <w:pPr>
-              <w:spacing w:after="120"/>
-              <w:rPr>
-                <w:sz w:val="24"/>
-                <w:szCs w:val="24"/>
-              </w:rPr>
-            </w:pPr>
-          </w:p>
-          <w:p>
-            <w:pPr>
-              <w:spacing w:after="120"/>
-              <w:rPr>
-                <w:sz w:val="24"/>
-                <w:szCs w:val="24"/>
-              </w:rPr>
-            </w:pPr>
-          </w:p>
-          <w:p>
-            <w:pPr>
-              <w:spacing w:after="120"/>
-              <w:rPr>
-                <w:sz w:val="24"/>
-                <w:szCs w:val="24"/>
-              </w:rPr>
-            </w:pPr>
-          </w:p>
-          <w:p>
-            <w:pPr>
-              <w:spacing w:after="120"/>
-              <w:rPr>
-                <w:sz w:val="24"/>
-                <w:szCs w:val="24"/>
-              </w:rPr>
-            </w:pPr>
+              <w:t> </w:t>
+            </w:r>
           </w:p>
         </w:tc>
       </w:tr>
@@ -2102,6 +3012,14 @@
       <w:r>
         <w:t>Determining Whether Retrieval Is Required</w:t>
       </w:r>
+      <w:r>
+        <w:t xml:space="preserve"> </w:t>
+      </w:r>
+      <w:proofErr w:type="spellStart"/>
+      <w:r>
+        <w:t>todo</w:t>
+      </w:r>
+      <w:proofErr w:type="spellEnd"/>
     </w:p>
     <w:p>
       <w:pPr>
@@ -2222,7 +3140,6 @@
                 <w:sz w:val="24"/>
                 <w:szCs w:val="24"/>
               </w:rPr>
-              <w:lastRenderedPageBreak/>
               <w:t xml:space="preserve">As shown in my last prompt about a specific error on </w:t>
             </w:r>
             <w:r>
@@ -2237,7 +3154,23 @@
                 <w:sz w:val="24"/>
                 <w:szCs w:val="24"/>
               </w:rPr>
-              <w:t xml:space="preserve"> and LLM gave a generic answer based on common sense not specific to the home grown product. In this situation the Retrieval is necessary to increase the accuracy</w:t>
+              <w:t xml:space="preserve"> and LLM gave a generic answer based on common sense not specific to the </w:t>
+            </w:r>
+            <w:proofErr w:type="gramStart"/>
+            <w:r>
+              <w:rPr>
+                <w:sz w:val="24"/>
+                <w:szCs w:val="24"/>
+              </w:rPr>
+              <w:t>home grown</w:t>
+            </w:r>
+            <w:proofErr w:type="gramEnd"/>
+            <w:r>
+              <w:rPr>
+                <w:sz w:val="24"/>
+                <w:szCs w:val="24"/>
+              </w:rPr>
+              <w:t xml:space="preserve"> product. In this situation the Retrieval is necessary to increase the accuracy</w:t>
             </w:r>
           </w:p>
           <w:p>
@@ -2268,7 +3201,7 @@
                           <pic:cNvPicPr/>
                         </pic:nvPicPr>
                         <pic:blipFill>
-                          <a:blip r:embed="rId15"/>
+                          <a:blip r:embed="rId19"/>
                           <a:stretch>
                             <a:fillRect/>
                           </a:stretch>
@@ -2350,6 +3283,7 @@
           <w:sz w:val="24"/>
           <w:szCs w:val="24"/>
         </w:rPr>
+        <w:lastRenderedPageBreak/>
         <w:t xml:space="preserve">Describe the types of information that would need to be retrieved to improve reliability, grounding, and response quality. Consider whether the information is proprietary, frequently changing, highly specific, or otherwise unavailable to the model without retrieval. </w:t>
       </w:r>
     </w:p>
@@ -2494,14 +3428,30 @@
                 <w:sz w:val="24"/>
                 <w:szCs w:val="24"/>
               </w:rPr>
-              <w:t xml:space="preserve">, products, home grown products,  </w:t>
-            </w:r>
-            <w:r>
-              <w:rPr>
-                <w:sz w:val="24"/>
-                <w:szCs w:val="24"/>
-              </w:rPr>
-              <w:t>company rules, customer records, product prices, legal updates, and technical documents. It also helps with private or highly specific information the model was not trained on.</w:t>
+              <w:t xml:space="preserve">, products, home grown </w:t>
+            </w:r>
+            <w:proofErr w:type="gramStart"/>
+            <w:r>
+              <w:rPr>
+                <w:sz w:val="24"/>
+                <w:szCs w:val="24"/>
+              </w:rPr>
+              <w:t xml:space="preserve">products,  </w:t>
+            </w:r>
+            <w:r>
+              <w:rPr>
+                <w:sz w:val="24"/>
+                <w:szCs w:val="24"/>
+              </w:rPr>
+              <w:t>company</w:t>
+            </w:r>
+            <w:proofErr w:type="gramEnd"/>
+            <w:r>
+              <w:rPr>
+                <w:sz w:val="24"/>
+                <w:szCs w:val="24"/>
+              </w:rPr>
+              <w:t xml:space="preserve"> rules, customer records, product prices, legal updates, and technical documents. It also helps with private or highly specific information the model was not trained on.</w:t>
             </w:r>
             <w:r>
               <w:rPr>
@@ -2524,14 +3474,14 @@
                 <w:sz w:val="24"/>
                 <w:szCs w:val="24"/>
               </w:rPr>
-              <w:t>As shown in previous examples</w:t>
-            </w:r>
-            <w:r>
-              <w:rPr>
-                <w:sz w:val="24"/>
-                <w:szCs w:val="24"/>
-              </w:rPr>
-              <w:t xml:space="preserve"> about current news and </w:t>
+              <w:t>In an example a</w:t>
+            </w:r>
+            <w:r>
+              <w:rPr>
+                <w:sz w:val="24"/>
+                <w:szCs w:val="24"/>
+              </w:rPr>
+              <w:t xml:space="preserve">bout current news and </w:t>
             </w:r>
             <w:r>
               <w:rPr>
@@ -2570,7 +3520,25 @@
                 <w:sz w:val="24"/>
                 <w:szCs w:val="24"/>
               </w:rPr>
-              <w:t> I asked a question on proprietary framework called Momentum. I got a answer which is not related, it sounds like more based on common sense and a guess.</w:t>
+              <w:t xml:space="preserve">I asked a question on proprietary framework called Momentum. I got </w:t>
+            </w:r>
+            <w:proofErr w:type="spellStart"/>
+            <w:proofErr w:type="gramStart"/>
+            <w:r>
+              <w:rPr>
+                <w:sz w:val="24"/>
+                <w:szCs w:val="24"/>
+              </w:rPr>
+              <w:t>a</w:t>
+            </w:r>
+            <w:proofErr w:type="spellEnd"/>
+            <w:proofErr w:type="gramEnd"/>
+            <w:r>
+              <w:rPr>
+                <w:sz w:val="24"/>
+                <w:szCs w:val="24"/>
+              </w:rPr>
+              <w:t xml:space="preserve"> answer which is not related, it sounds like more based on common sense and a guess.</w:t>
             </w:r>
           </w:p>
           <w:p>
@@ -2599,10 +3567,10 @@
             </w:pPr>
             <w:r>
               <w:rPr>
-                <w:sz w:val="24"/>
-                <w:szCs w:val="24"/>
-              </w:rPr>
-              <w:lastRenderedPageBreak/>
+                <w:noProof/>
+                <w:sz w:val="24"/>
+                <w:szCs w:val="24"/>
+              </w:rPr>
               <w:drawing>
                 <wp:inline distT="0" distB="0" distL="0" distR="0" wp14:anchorId="23A728E9" wp14:editId="0EA40B60">
                   <wp:extent cx="6263640" cy="1280160"/>
@@ -2621,7 +3589,7 @@
                           </pic:cNvPicPr>
                         </pic:nvPicPr>
                         <pic:blipFill>
-                          <a:blip r:embed="rId13">
+                          <a:blip r:embed="rId20">
                             <a:extLst>
                               <a:ext uri="{28A0092B-C50C-407E-A947-70E740481C1C}">
                                 <a14:useLocalDpi xmlns:a14="http://schemas.microsoft.com/office/drawing/2010/main" val="0"/>
@@ -2681,7 +3649,23 @@
                 <w:sz w:val="24"/>
                 <w:szCs w:val="24"/>
               </w:rPr>
-              <w:t>Prompt: what is the current situation on the strait of hormuz?</w:t>
+              <w:t xml:space="preserve">Prompt: what is the current situation on the strait of </w:t>
+            </w:r>
+            <w:proofErr w:type="spellStart"/>
+            <w:r>
+              <w:rPr>
+                <w:sz w:val="24"/>
+                <w:szCs w:val="24"/>
+              </w:rPr>
+              <w:t>hormuz</w:t>
+            </w:r>
+            <w:proofErr w:type="spellEnd"/>
+            <w:r>
+              <w:rPr>
+                <w:sz w:val="24"/>
+                <w:szCs w:val="24"/>
+              </w:rPr>
+              <w:t>?</w:t>
             </w:r>
           </w:p>
           <w:p>
@@ -2724,11 +3708,12 @@
             </w:pPr>
             <w:r>
               <w:rPr>
+                <w:noProof/>
                 <w:sz w:val="24"/>
                 <w:szCs w:val="24"/>
               </w:rPr>
               <w:drawing>
-                <wp:inline distT="0" distB="0" distL="0" distR="0" wp14:anchorId="7E5CC63D" wp14:editId="76675383">
+                <wp:inline distT="0" distB="0" distL="0" distR="0" wp14:anchorId="7E5CC63D" wp14:editId="63F839DC">
                   <wp:extent cx="6263640" cy="719455"/>
                   <wp:effectExtent l="0" t="0" r="3810" b="4445"/>
                   <wp:docPr id="560733385" name="Picture 5"/>
@@ -2745,7 +3730,7 @@
                           </pic:cNvPicPr>
                         </pic:nvPicPr>
                         <pic:blipFill>
-                          <a:blip r:embed="rId12" cstate="print">
+                          <a:blip r:embed="rId21" cstate="print">
                             <a:extLst>
                               <a:ext uri="{28A0092B-C50C-407E-A947-70E740481C1C}">
                                 <a14:useLocalDpi xmlns:a14="http://schemas.microsoft.com/office/drawing/2010/main" val="0"/>
@@ -2779,116 +3764,18 @@
           </w:p>
           <w:p>
             <w:pPr>
-              <w:rPr>
-                <w:b/>
-                <w:bCs/>
-                <w:sz w:val="24"/>
-                <w:szCs w:val="24"/>
-              </w:rPr>
-            </w:pPr>
-            <w:r>
-              <w:rPr>
-                <w:b/>
-                <w:bCs/>
-                <w:sz w:val="24"/>
-                <w:szCs w:val="24"/>
-              </w:rPr>
-              <w:t xml:space="preserve">Retrieval </w:t>
-            </w:r>
-            <w:r>
-              <w:rPr>
-                <w:b/>
-                <w:bCs/>
-                <w:sz w:val="24"/>
-                <w:szCs w:val="24"/>
-              </w:rPr>
-              <w:t>is not necessary</w:t>
-            </w:r>
-          </w:p>
-          <w:p>
-            <w:pPr>
-              <w:rPr>
-                <w:sz w:val="24"/>
-                <w:szCs w:val="24"/>
-              </w:rPr>
-            </w:pPr>
-            <w:r>
-              <w:rPr>
-                <w:sz w:val="24"/>
-                <w:szCs w:val="24"/>
-              </w:rPr>
-              <w:t>LLMs can handle and works well on following use cases and r</w:t>
-            </w:r>
-            <w:r>
-              <w:rPr>
-                <w:sz w:val="24"/>
-                <w:szCs w:val="24"/>
-              </w:rPr>
-              <w:t>etrieval is not required</w:t>
-            </w:r>
-            <w:r>
-              <w:rPr>
-                <w:sz w:val="24"/>
-                <w:szCs w:val="24"/>
-              </w:rPr>
-              <w:t>-</w:t>
-            </w:r>
-          </w:p>
-          <w:p>
-            <w:pPr>
               <w:pStyle w:val="ListBullet"/>
-              <w:rPr>
-                <w:sz w:val="24"/>
-                <w:szCs w:val="24"/>
-              </w:rPr>
-            </w:pPr>
-            <w:r>
-              <w:rPr>
-                <w:sz w:val="24"/>
-                <w:szCs w:val="24"/>
-              </w:rPr>
-              <w:t>Common domain knowledge available publicly</w:t>
-            </w:r>
-          </w:p>
-          <w:p>
-            <w:pPr>
-              <w:pStyle w:val="ListBullet"/>
-              <w:rPr>
-                <w:sz w:val="24"/>
-                <w:szCs w:val="24"/>
-              </w:rPr>
-            </w:pPr>
-            <w:r>
-              <w:rPr>
-                <w:sz w:val="24"/>
-                <w:szCs w:val="24"/>
-              </w:rPr>
-              <w:t>General Reasoning</w:t>
-            </w:r>
-            <w:r>
-              <w:rPr>
-                <w:sz w:val="24"/>
-                <w:szCs w:val="24"/>
-              </w:rPr>
-              <w:t xml:space="preserve"> like solving math’s problem</w:t>
-            </w:r>
-          </w:p>
-          <w:p>
-            <w:pPr>
-              <w:pStyle w:val="ListBullet"/>
-              <w:spacing w:after="120"/>
-              <w:rPr>
-                <w:sz w:val="24"/>
-                <w:szCs w:val="24"/>
-              </w:rPr>
-            </w:pPr>
-            <w:r>
-              <w:rPr>
-                <w:sz w:val="24"/>
-                <w:szCs w:val="24"/>
-              </w:rPr>
-              <w:t>Common computer programming/logic writing and debugging</w:t>
-            </w:r>
+              <w:numPr>
+                <w:ilvl w:val="0"/>
+                <w:numId w:val="0"/>
+              </w:numPr>
+              <w:spacing w:after="120"/>
+              <w:ind w:left="360" w:hanging="360"/>
+              <w:rPr>
+                <w:sz w:val="24"/>
+                <w:szCs w:val="24"/>
+              </w:rPr>
+            </w:pPr>
           </w:p>
         </w:tc>
       </w:tr>
@@ -2933,6 +3820,7 @@
                 <w:sz w:val="24"/>
                 <w:szCs w:val="24"/>
               </w:rPr>
+              <w:lastRenderedPageBreak/>
               <w:t>When retrieval would or would not be necessary</w:t>
             </w:r>
           </w:p>
@@ -2961,27 +3849,293 @@
             </w:pPr>
             <w:r>
               <w:rPr>
-                <w:sz w:val="24"/>
-                <w:szCs w:val="24"/>
-              </w:rPr>
-              <w:t>Response:</w:t>
-            </w:r>
-          </w:p>
-          <w:p>
-            <w:pPr>
-              <w:spacing w:after="120"/>
-              <w:rPr>
-                <w:sz w:val="24"/>
-                <w:szCs w:val="24"/>
-              </w:rPr>
-            </w:pPr>
-            <w:r>
-              <w:rPr>
-                <w:sz w:val="24"/>
-                <w:szCs w:val="24"/>
-              </w:rPr>
-              <w:t>It improves reliability by grounding answers in real, relevant sources. Retrieval is needed when facts may change or must be exact. It is less necessary for common knowledge, basic explanations, writing help, or tasks that do not depend on current or private information.</w:t>
-            </w:r>
+                <w:b/>
+                <w:bCs/>
+                <w:sz w:val="24"/>
+                <w:szCs w:val="24"/>
+              </w:rPr>
+              <w:t>Retrieval is needed</w:t>
+            </w:r>
+            <w:r>
+              <w:rPr>
+                <w:sz w:val="24"/>
+                <w:szCs w:val="24"/>
+              </w:rPr>
+              <w:t xml:space="preserve"> </w:t>
+            </w:r>
+          </w:p>
+          <w:p>
+            <w:pPr>
+              <w:rPr>
+                <w:sz w:val="24"/>
+                <w:szCs w:val="24"/>
+              </w:rPr>
+            </w:pPr>
+            <w:r>
+              <w:rPr>
+                <w:sz w:val="24"/>
+                <w:szCs w:val="24"/>
+              </w:rPr>
+              <w:t>It improves reliability by grounding answers in real, relevant sources.</w:t>
+            </w:r>
+            <w:r>
+              <w:rPr>
+                <w:sz w:val="24"/>
+                <w:szCs w:val="24"/>
+              </w:rPr>
+              <w:t xml:space="preserve"> It is required in following use cases-</w:t>
+            </w:r>
+          </w:p>
+          <w:p>
+            <w:pPr>
+              <w:pStyle w:val="ListBullet"/>
+              <w:rPr>
+                <w:b/>
+                <w:bCs/>
+                <w:sz w:val="24"/>
+                <w:szCs w:val="24"/>
+              </w:rPr>
+            </w:pPr>
+            <w:r>
+              <w:rPr>
+                <w:sz w:val="24"/>
+                <w:szCs w:val="24"/>
+              </w:rPr>
+              <w:t>Proprietary Knowledge</w:t>
+            </w:r>
+          </w:p>
+          <w:p>
+            <w:pPr>
+              <w:pStyle w:val="ListBullet"/>
+              <w:rPr>
+                <w:sz w:val="24"/>
+                <w:szCs w:val="24"/>
+              </w:rPr>
+            </w:pPr>
+            <w:r>
+              <w:rPr>
+                <w:sz w:val="24"/>
+                <w:szCs w:val="24"/>
+              </w:rPr>
+              <w:t>R</w:t>
+            </w:r>
+            <w:r>
+              <w:rPr>
+                <w:sz w:val="24"/>
+                <w:szCs w:val="24"/>
+              </w:rPr>
+              <w:t>eal-time</w:t>
+            </w:r>
+            <w:r>
+              <w:rPr>
+                <w:sz w:val="24"/>
+                <w:szCs w:val="24"/>
+              </w:rPr>
+              <w:t xml:space="preserve"> </w:t>
+            </w:r>
+            <w:r>
+              <w:rPr>
+                <w:sz w:val="24"/>
+                <w:szCs w:val="24"/>
+              </w:rPr>
+              <w:t>or time-sensitive data</w:t>
+            </w:r>
+          </w:p>
+          <w:p>
+            <w:pPr>
+              <w:pStyle w:val="ListBullet"/>
+              <w:rPr>
+                <w:sz w:val="24"/>
+                <w:szCs w:val="24"/>
+              </w:rPr>
+            </w:pPr>
+            <w:r>
+              <w:rPr>
+                <w:sz w:val="24"/>
+                <w:szCs w:val="24"/>
+              </w:rPr>
+              <w:t>Reducing Hallucinations</w:t>
+            </w:r>
+          </w:p>
+          <w:p>
+            <w:pPr>
+              <w:pStyle w:val="ListBullet"/>
+              <w:rPr>
+                <w:sz w:val="24"/>
+                <w:szCs w:val="24"/>
+              </w:rPr>
+            </w:pPr>
+            <w:r>
+              <w:rPr>
+                <w:sz w:val="24"/>
+                <w:szCs w:val="24"/>
+              </w:rPr>
+              <w:t>Domain, product, technology, research papers or policy not available in public</w:t>
+            </w:r>
+            <w:r>
+              <w:rPr>
+                <w:sz w:val="24"/>
+                <w:szCs w:val="24"/>
+              </w:rPr>
+              <w:t xml:space="preserve">. </w:t>
+            </w:r>
+            <w:r>
+              <w:rPr>
+                <w:sz w:val="24"/>
+                <w:szCs w:val="24"/>
+              </w:rPr>
+              <w:t>Sometimes</w:t>
+            </w:r>
+            <w:r>
+              <w:rPr>
+                <w:sz w:val="24"/>
+                <w:szCs w:val="24"/>
+              </w:rPr>
+              <w:t xml:space="preserve"> retrieval is needed even when information is available in public domain</w:t>
+            </w:r>
+            <w:r>
+              <w:rPr>
+                <w:sz w:val="24"/>
+                <w:szCs w:val="24"/>
+              </w:rPr>
+              <w:t xml:space="preserve"> to reduce the hallucination, memory limits etc.</w:t>
+            </w:r>
+          </w:p>
+          <w:p>
+            <w:pPr>
+              <w:pStyle w:val="ListBullet"/>
+              <w:numPr>
+                <w:ilvl w:val="0"/>
+                <w:numId w:val="0"/>
+              </w:numPr>
+              <w:rPr>
+                <w:b/>
+                <w:bCs/>
+                <w:sz w:val="24"/>
+                <w:szCs w:val="24"/>
+              </w:rPr>
+            </w:pPr>
+          </w:p>
+          <w:p>
+            <w:pPr>
+              <w:pStyle w:val="ListBullet"/>
+              <w:numPr>
+                <w:ilvl w:val="0"/>
+                <w:numId w:val="0"/>
+              </w:numPr>
+              <w:rPr>
+                <w:b/>
+                <w:bCs/>
+                <w:sz w:val="24"/>
+                <w:szCs w:val="24"/>
+              </w:rPr>
+            </w:pPr>
+            <w:r>
+              <w:rPr>
+                <w:b/>
+                <w:bCs/>
+                <w:sz w:val="24"/>
+                <w:szCs w:val="24"/>
+              </w:rPr>
+              <w:t>Retrieval is not necessary</w:t>
+            </w:r>
+            <w:r>
+              <w:rPr>
+                <w:b/>
+                <w:bCs/>
+                <w:sz w:val="24"/>
+                <w:szCs w:val="24"/>
+              </w:rPr>
+              <w:t xml:space="preserve"> when</w:t>
+            </w:r>
+          </w:p>
+          <w:p>
+            <w:pPr>
+              <w:rPr>
+                <w:sz w:val="24"/>
+                <w:szCs w:val="24"/>
+              </w:rPr>
+            </w:pPr>
+            <w:r>
+              <w:rPr>
+                <w:sz w:val="24"/>
+                <w:szCs w:val="24"/>
+              </w:rPr>
+              <w:t>LLMs can handle and works well on following use cases and r</w:t>
+            </w:r>
+            <w:r>
+              <w:rPr>
+                <w:sz w:val="24"/>
+                <w:szCs w:val="24"/>
+              </w:rPr>
+              <w:t>etrieval is not required</w:t>
+            </w:r>
+            <w:r>
+              <w:rPr>
+                <w:sz w:val="24"/>
+                <w:szCs w:val="24"/>
+              </w:rPr>
+              <w:t>-</w:t>
+            </w:r>
+          </w:p>
+          <w:p>
+            <w:pPr>
+              <w:pStyle w:val="ListBullet"/>
+              <w:rPr>
+                <w:sz w:val="24"/>
+                <w:szCs w:val="24"/>
+              </w:rPr>
+            </w:pPr>
+            <w:r>
+              <w:rPr>
+                <w:sz w:val="24"/>
+                <w:szCs w:val="24"/>
+              </w:rPr>
+              <w:t>General Reasoning like solving math’s problem</w:t>
+            </w:r>
+          </w:p>
+          <w:p>
+            <w:pPr>
+              <w:pStyle w:val="ListBullet"/>
+              <w:spacing w:after="120"/>
+              <w:rPr>
+                <w:sz w:val="24"/>
+                <w:szCs w:val="24"/>
+              </w:rPr>
+            </w:pPr>
+            <w:r>
+              <w:rPr>
+                <w:sz w:val="24"/>
+                <w:szCs w:val="24"/>
+              </w:rPr>
+              <w:t>Common computer programming/logic writing and debugging</w:t>
+            </w:r>
+          </w:p>
+          <w:p>
+            <w:pPr>
+              <w:pStyle w:val="ListBullet"/>
+              <w:spacing w:after="120"/>
+              <w:rPr>
+                <w:sz w:val="24"/>
+                <w:szCs w:val="24"/>
+              </w:rPr>
+            </w:pPr>
+            <w:r>
+              <w:rPr>
+                <w:sz w:val="24"/>
+                <w:szCs w:val="24"/>
+              </w:rPr>
+              <w:t>When it is acceptable to search outside of the knowledge base provided</w:t>
+            </w:r>
+          </w:p>
+          <w:p>
+            <w:pPr>
+              <w:spacing w:after="120"/>
+              <w:rPr>
+                <w:sz w:val="24"/>
+                <w:szCs w:val="24"/>
+              </w:rPr>
+            </w:pPr>
           </w:p>
           <w:p>
             <w:pPr>
@@ -3068,7 +4222,11 @@
         </w:rPr>
       </w:pPr>
       <w:r>
-        <w:t>Explain how the precision, relevance, and accuracy of retrieved information affect output quality, system reliability, and user trust. Consider how retrieval quality might improve or degrade system performance. What could happen if the retrieved information is incomplete, loosely related, outdated, or inaccurate</w:t>
+        <w:t xml:space="preserve">Explain how the precision, relevance, and accuracy of retrieved information affect output quality, system reliability, and user trust. Consider how retrieval quality might improve or degrade </w:t>
+      </w:r>
+      <w:r>
+        <w:lastRenderedPageBreak/>
+        <w:t>system performance. What could happen if the retrieved information is incomplete, loosely related, outdated, or inaccurate</w:t>
       </w:r>
       <w:r>
         <w:t>?</w:t>
@@ -3492,53 +4650,156 @@
                 <w:sz w:val="24"/>
                 <w:szCs w:val="24"/>
               </w:rPr>
-              <w:t xml:space="preserve"> Limitations- failed to provide non-public information like my company’s HR policy. Could not answer most recent update which might be deliberate because of some political reasons also.</w:t>
-            </w:r>
-          </w:p>
-          <w:p>
-            <w:pPr>
-              <w:rPr>
-                <w:sz w:val="24"/>
-                <w:szCs w:val="24"/>
-              </w:rPr>
-            </w:pPr>
-            <w:r>
-              <w:rPr>
-                <w:sz w:val="24"/>
-                <w:szCs w:val="24"/>
-              </w:rPr>
-              <w:t>Common failure modes- failed on follow up questions when conversation history was off, domain specific questions</w:t>
-            </w:r>
-          </w:p>
-          <w:p>
-            <w:pPr>
-              <w:rPr>
-                <w:sz w:val="24"/>
-                <w:szCs w:val="24"/>
-              </w:rPr>
-            </w:pPr>
-            <w:r>
-              <w:rPr>
-                <w:sz w:val="24"/>
-                <w:szCs w:val="24"/>
-              </w:rPr>
-              <w:lastRenderedPageBreak/>
-              <w:t>Retrieval Needs- for non-public information, domain specific knowledge</w:t>
-            </w:r>
-          </w:p>
-          <w:p>
-            <w:pPr>
-              <w:rPr>
-                <w:sz w:val="24"/>
-                <w:szCs w:val="24"/>
-              </w:rPr>
-            </w:pPr>
-            <w:r>
-              <w:rPr>
-                <w:sz w:val="24"/>
-                <w:szCs w:val="24"/>
-              </w:rPr>
-              <w:t xml:space="preserve">Improvement- </w:t>
+              <w:t xml:space="preserve"> </w:t>
+            </w:r>
+          </w:p>
+          <w:p>
+            <w:pPr>
+              <w:rPr>
+                <w:sz w:val="24"/>
+                <w:szCs w:val="24"/>
+              </w:rPr>
+            </w:pPr>
+            <w:r>
+              <w:rPr>
+                <w:b/>
+                <w:bCs/>
+                <w:sz w:val="24"/>
+                <w:szCs w:val="24"/>
+              </w:rPr>
+              <w:t>Limitations</w:t>
+            </w:r>
+            <w:r>
+              <w:rPr>
+                <w:sz w:val="24"/>
+                <w:szCs w:val="24"/>
+              </w:rPr>
+              <w:t xml:space="preserve">- </w:t>
+            </w:r>
+            <w:r>
+              <w:rPr>
+                <w:sz w:val="24"/>
+                <w:szCs w:val="24"/>
+              </w:rPr>
+              <w:t xml:space="preserve">When I used complex references in my prompt, it failed to answer while </w:t>
+            </w:r>
+            <w:proofErr w:type="gramStart"/>
+            <w:r>
+              <w:rPr>
+                <w:sz w:val="24"/>
+                <w:szCs w:val="24"/>
+              </w:rPr>
+              <w:t>It</w:t>
+            </w:r>
+            <w:proofErr w:type="gramEnd"/>
+            <w:r>
+              <w:rPr>
+                <w:sz w:val="24"/>
+                <w:szCs w:val="24"/>
+              </w:rPr>
+              <w:t xml:space="preserve"> answered correctly when I asked the direct question</w:t>
+            </w:r>
+          </w:p>
+          <w:p>
+            <w:pPr>
+              <w:rPr>
+                <w:sz w:val="24"/>
+                <w:szCs w:val="24"/>
+              </w:rPr>
+            </w:pPr>
+            <w:r>
+              <w:rPr>
+                <w:b/>
+                <w:bCs/>
+                <w:sz w:val="24"/>
+                <w:szCs w:val="24"/>
+              </w:rPr>
+              <w:t>Common failure modes</w:t>
+            </w:r>
+            <w:r>
+              <w:rPr>
+                <w:sz w:val="24"/>
+                <w:szCs w:val="24"/>
+              </w:rPr>
+              <w:t xml:space="preserve">- failed on follow up questions when conversation history was </w:t>
+            </w:r>
+            <w:r>
+              <w:rPr>
+                <w:sz w:val="24"/>
+                <w:szCs w:val="24"/>
+              </w:rPr>
+              <w:t>long</w:t>
+            </w:r>
+          </w:p>
+          <w:p>
+            <w:pPr>
+              <w:rPr>
+                <w:sz w:val="24"/>
+                <w:szCs w:val="24"/>
+              </w:rPr>
+            </w:pPr>
+            <w:r>
+              <w:rPr>
+                <w:b/>
+                <w:bCs/>
+                <w:sz w:val="24"/>
+                <w:szCs w:val="24"/>
+              </w:rPr>
+              <w:t>Retrieval Needs</w:t>
+            </w:r>
+            <w:r>
+              <w:rPr>
+                <w:sz w:val="24"/>
+                <w:szCs w:val="24"/>
+              </w:rPr>
+              <w:t>- for non-public information, domain specific knowledge</w:t>
+            </w:r>
+          </w:p>
+          <w:p>
+            <w:pPr>
+              <w:rPr>
+                <w:sz w:val="24"/>
+                <w:szCs w:val="24"/>
+              </w:rPr>
+            </w:pPr>
+            <w:r>
+              <w:rPr>
+                <w:b/>
+                <w:bCs/>
+                <w:sz w:val="24"/>
+                <w:szCs w:val="24"/>
+              </w:rPr>
+              <w:t>Improvement</w:t>
+            </w:r>
+            <w:r>
+              <w:rPr>
+                <w:sz w:val="24"/>
+                <w:szCs w:val="24"/>
+              </w:rPr>
+              <w:t xml:space="preserve">- </w:t>
+            </w:r>
+            <w:r>
+              <w:rPr>
+                <w:sz w:val="24"/>
+                <w:szCs w:val="24"/>
+              </w:rPr>
+              <w:t xml:space="preserve">Need to try some other algorithms for so that complex reference issue can be addressed. For </w:t>
+            </w:r>
+            <w:proofErr w:type="gramStart"/>
+            <w:r>
+              <w:rPr>
+                <w:sz w:val="24"/>
+                <w:szCs w:val="24"/>
+              </w:rPr>
+              <w:t>now</w:t>
+            </w:r>
+            <w:proofErr w:type="gramEnd"/>
+            <w:r>
+              <w:rPr>
+                <w:sz w:val="24"/>
+                <w:szCs w:val="24"/>
+              </w:rPr>
+              <w:t xml:space="preserve"> I used bm25 which is mainly based on keyword, next step should be try some algorithm which address semantic issues rather than keywords</w:t>
             </w:r>
           </w:p>
           <w:p>
@@ -3771,7 +5032,7 @@
                 <w:szCs w:val="24"/>
               </w:rPr>
             </w:pPr>
-            <w:hyperlink r:id="rId16" w:history="1">
+            <w:hyperlink r:id="rId22" w:history="1">
               <w:r>
                 <w:rPr>
                   <w:rStyle w:val="Hyperlink"/>
@@ -4026,10 +5287,10 @@
       </w:r>
     </w:p>
     <w:sectPr>
-      <w:headerReference w:type="even" r:id="rId17"/>
-      <w:headerReference w:type="default" r:id="rId18"/>
-      <w:footerReference w:type="default" r:id="rId19"/>
-      <w:headerReference w:type="first" r:id="rId20"/>
+      <w:headerReference w:type="even" r:id="rId23"/>
+      <w:headerReference w:type="default" r:id="rId24"/>
+      <w:footerReference w:type="default" r:id="rId25"/>
+      <w:headerReference w:type="first" r:id="rId26"/>
       <w:pgSz w:w="12240" w:h="15840"/>
       <w:pgMar w:top="1440" w:right="567" w:bottom="1440" w:left="567" w:header="57" w:footer="170" w:gutter="0"/>
       <w:pgNumType w:start="1"/>
@@ -4074,8 +5335,19 @@
         <w:sz w:val="22"/>
         <w:szCs w:val="22"/>
       </w:rPr>
-      <w:t>© MIT xPRO</w:t>
+      <w:t xml:space="preserve">© MIT </w:t>
     </w:r>
+    <w:proofErr w:type="spellStart"/>
+    <w:r>
+      <w:rPr>
+        <w:rFonts w:ascii="Calibri" w:eastAsia="Calibri" w:hAnsi="Calibri" w:cs="Calibri"/>
+        <w:color w:val="000000"/>
+        <w:sz w:val="22"/>
+        <w:szCs w:val="22"/>
+      </w:rPr>
+      <w:t>xPRO</w:t>
+    </w:r>
+    <w:proofErr w:type="spellEnd"/>
     <w:r>
       <w:rPr>
         <w:rFonts w:ascii="Calibri" w:eastAsia="Calibri" w:hAnsi="Calibri" w:cs="Calibri"/>
@@ -4746,7 +6018,7 @@
   <w:abstractNum w:abstractNumId="0" w15:restartNumberingAfterBreak="0">
     <w:nsid w:val="FFFFFF89"/>
     <w:multiLevelType w:val="singleLevel"/>
-    <w:tmpl w:val="F02ECF30"/>
+    <w:tmpl w:val="1B829B58"/>
     <w:lvl w:ilvl="0">
       <w:start w:val="1"/>
       <w:numFmt w:val="bullet"/>
@@ -4765,6 +6037,155 @@
     </w:lvl>
   </w:abstractNum>
   <w:abstractNum w:abstractNumId="1" w15:restartNumberingAfterBreak="0">
+    <w:nsid w:val="09C04EA5"/>
+    <w:multiLevelType w:val="multilevel"/>
+    <w:tmpl w:val="BF3E33BA"/>
+    <w:lvl w:ilvl="0">
+      <w:start w:val="1"/>
+      <w:numFmt w:val="bullet"/>
+      <w:lvlText w:val=""/>
+      <w:lvlJc w:val="left"/>
+      <w:pPr>
+        <w:tabs>
+          <w:tab w:val="num" w:pos="720"/>
+        </w:tabs>
+        <w:ind w:left="720" w:hanging="360"/>
+      </w:pPr>
+      <w:rPr>
+        <w:rFonts w:ascii="Symbol" w:hAnsi="Symbol" w:hint="default"/>
+        <w:sz w:val="20"/>
+      </w:rPr>
+    </w:lvl>
+    <w:lvl w:ilvl="1" w:tentative="1">
+      <w:start w:val="1"/>
+      <w:numFmt w:val="bullet"/>
+      <w:lvlText w:val="o"/>
+      <w:lvlJc w:val="left"/>
+      <w:pPr>
+        <w:tabs>
+          <w:tab w:val="num" w:pos="1440"/>
+        </w:tabs>
+        <w:ind w:left="1440" w:hanging="360"/>
+      </w:pPr>
+      <w:rPr>
+        <w:rFonts w:ascii="Courier New" w:hAnsi="Courier New" w:hint="default"/>
+        <w:sz w:val="20"/>
+      </w:rPr>
+    </w:lvl>
+    <w:lvl w:ilvl="2" w:tentative="1">
+      <w:start w:val="1"/>
+      <w:numFmt w:val="bullet"/>
+      <w:lvlText w:val=""/>
+      <w:lvlJc w:val="left"/>
+      <w:pPr>
+        <w:tabs>
+          <w:tab w:val="num" w:pos="2160"/>
+        </w:tabs>
+        <w:ind w:left="2160" w:hanging="360"/>
+      </w:pPr>
+      <w:rPr>
+        <w:rFonts w:ascii="Wingdings" w:hAnsi="Wingdings" w:hint="default"/>
+        <w:sz w:val="20"/>
+      </w:rPr>
+    </w:lvl>
+    <w:lvl w:ilvl="3" w:tentative="1">
+      <w:start w:val="1"/>
+      <w:numFmt w:val="bullet"/>
+      <w:lvlText w:val=""/>
+      <w:lvlJc w:val="left"/>
+      <w:pPr>
+        <w:tabs>
+          <w:tab w:val="num" w:pos="2880"/>
+        </w:tabs>
+        <w:ind w:left="2880" w:hanging="360"/>
+      </w:pPr>
+      <w:rPr>
+        <w:rFonts w:ascii="Wingdings" w:hAnsi="Wingdings" w:hint="default"/>
+        <w:sz w:val="20"/>
+      </w:rPr>
+    </w:lvl>
+    <w:lvl w:ilvl="4" w:tentative="1">
+      <w:start w:val="1"/>
+      <w:numFmt w:val="bullet"/>
+      <w:lvlText w:val=""/>
+      <w:lvlJc w:val="left"/>
+      <w:pPr>
+        <w:tabs>
+          <w:tab w:val="num" w:pos="3600"/>
+        </w:tabs>
+        <w:ind w:left="3600" w:hanging="360"/>
+      </w:pPr>
+      <w:rPr>
+        <w:rFonts w:ascii="Wingdings" w:hAnsi="Wingdings" w:hint="default"/>
+        <w:sz w:val="20"/>
+      </w:rPr>
+    </w:lvl>
+    <w:lvl w:ilvl="5" w:tentative="1">
+      <w:start w:val="1"/>
+      <w:numFmt w:val="bullet"/>
+      <w:lvlText w:val=""/>
+      <w:lvlJc w:val="left"/>
+      <w:pPr>
+        <w:tabs>
+          <w:tab w:val="num" w:pos="4320"/>
+        </w:tabs>
+        <w:ind w:left="4320" w:hanging="360"/>
+      </w:pPr>
+      <w:rPr>
+        <w:rFonts w:ascii="Wingdings" w:hAnsi="Wingdings" w:hint="default"/>
+        <w:sz w:val="20"/>
+      </w:rPr>
+    </w:lvl>
+    <w:lvl w:ilvl="6" w:tentative="1">
+      <w:start w:val="1"/>
+      <w:numFmt w:val="bullet"/>
+      <w:lvlText w:val=""/>
+      <w:lvlJc w:val="left"/>
+      <w:pPr>
+        <w:tabs>
+          <w:tab w:val="num" w:pos="5040"/>
+        </w:tabs>
+        <w:ind w:left="5040" w:hanging="360"/>
+      </w:pPr>
+      <w:rPr>
+        <w:rFonts w:ascii="Wingdings" w:hAnsi="Wingdings" w:hint="default"/>
+        <w:sz w:val="20"/>
+      </w:rPr>
+    </w:lvl>
+    <w:lvl w:ilvl="7" w:tentative="1">
+      <w:start w:val="1"/>
+      <w:numFmt w:val="bullet"/>
+      <w:lvlText w:val=""/>
+      <w:lvlJc w:val="left"/>
+      <w:pPr>
+        <w:tabs>
+          <w:tab w:val="num" w:pos="5760"/>
+        </w:tabs>
+        <w:ind w:left="5760" w:hanging="360"/>
+      </w:pPr>
+      <w:rPr>
+        <w:rFonts w:ascii="Wingdings" w:hAnsi="Wingdings" w:hint="default"/>
+        <w:sz w:val="20"/>
+      </w:rPr>
+    </w:lvl>
+    <w:lvl w:ilvl="8" w:tentative="1">
+      <w:start w:val="1"/>
+      <w:numFmt w:val="bullet"/>
+      <w:lvlText w:val=""/>
+      <w:lvlJc w:val="left"/>
+      <w:pPr>
+        <w:tabs>
+          <w:tab w:val="num" w:pos="6480"/>
+        </w:tabs>
+        <w:ind w:left="6480" w:hanging="360"/>
+      </w:pPr>
+      <w:rPr>
+        <w:rFonts w:ascii="Wingdings" w:hAnsi="Wingdings" w:hint="default"/>
+        <w:sz w:val="20"/>
+      </w:rPr>
+    </w:lvl>
+  </w:abstractNum>
+  <w:abstractNum w:abstractNumId="2" w15:restartNumberingAfterBreak="0">
     <w:nsid w:val="19DA76D6"/>
     <w:multiLevelType w:val="hybridMultilevel"/>
     <w:tmpl w:val="613A472E"/>
@@ -4877,7 +6298,7 @@
       </w:rPr>
     </w:lvl>
   </w:abstractNum>
-  <w:abstractNum w:abstractNumId="2" w15:restartNumberingAfterBreak="0">
+  <w:abstractNum w:abstractNumId="3" w15:restartNumberingAfterBreak="0">
     <w:nsid w:val="1A91712A"/>
     <w:multiLevelType w:val="hybridMultilevel"/>
     <w:tmpl w:val="6660CDC0"/>
@@ -4990,7 +6411,7 @@
       </w:rPr>
     </w:lvl>
   </w:abstractNum>
-  <w:abstractNum w:abstractNumId="3" w15:restartNumberingAfterBreak="0">
+  <w:abstractNum w:abstractNumId="4" w15:restartNumberingAfterBreak="0">
     <w:nsid w:val="27F17592"/>
     <w:multiLevelType w:val="hybridMultilevel"/>
     <w:tmpl w:val="447CC156"/>
@@ -5103,7 +6524,156 @@
       </w:rPr>
     </w:lvl>
   </w:abstractNum>
-  <w:abstractNum w:abstractNumId="4" w15:restartNumberingAfterBreak="0">
+  <w:abstractNum w:abstractNumId="5" w15:restartNumberingAfterBreak="0">
+    <w:nsid w:val="28E043BD"/>
+    <w:multiLevelType w:val="multilevel"/>
+    <w:tmpl w:val="EFE48C9E"/>
+    <w:lvl w:ilvl="0">
+      <w:start w:val="1"/>
+      <w:numFmt w:val="bullet"/>
+      <w:lvlText w:val=""/>
+      <w:lvlJc w:val="left"/>
+      <w:pPr>
+        <w:tabs>
+          <w:tab w:val="num" w:pos="720"/>
+        </w:tabs>
+        <w:ind w:left="720" w:hanging="360"/>
+      </w:pPr>
+      <w:rPr>
+        <w:rFonts w:ascii="Symbol" w:hAnsi="Symbol" w:hint="default"/>
+        <w:sz w:val="20"/>
+      </w:rPr>
+    </w:lvl>
+    <w:lvl w:ilvl="1" w:tentative="1">
+      <w:start w:val="1"/>
+      <w:numFmt w:val="bullet"/>
+      <w:lvlText w:val="o"/>
+      <w:lvlJc w:val="left"/>
+      <w:pPr>
+        <w:tabs>
+          <w:tab w:val="num" w:pos="1440"/>
+        </w:tabs>
+        <w:ind w:left="1440" w:hanging="360"/>
+      </w:pPr>
+      <w:rPr>
+        <w:rFonts w:ascii="Courier New" w:hAnsi="Courier New" w:hint="default"/>
+        <w:sz w:val="20"/>
+      </w:rPr>
+    </w:lvl>
+    <w:lvl w:ilvl="2" w:tentative="1">
+      <w:start w:val="1"/>
+      <w:numFmt w:val="bullet"/>
+      <w:lvlText w:val=""/>
+      <w:lvlJc w:val="left"/>
+      <w:pPr>
+        <w:tabs>
+          <w:tab w:val="num" w:pos="2160"/>
+        </w:tabs>
+        <w:ind w:left="2160" w:hanging="360"/>
+      </w:pPr>
+      <w:rPr>
+        <w:rFonts w:ascii="Wingdings" w:hAnsi="Wingdings" w:hint="default"/>
+        <w:sz w:val="20"/>
+      </w:rPr>
+    </w:lvl>
+    <w:lvl w:ilvl="3" w:tentative="1">
+      <w:start w:val="1"/>
+      <w:numFmt w:val="bullet"/>
+      <w:lvlText w:val=""/>
+      <w:lvlJc w:val="left"/>
+      <w:pPr>
+        <w:tabs>
+          <w:tab w:val="num" w:pos="2880"/>
+        </w:tabs>
+        <w:ind w:left="2880" w:hanging="360"/>
+      </w:pPr>
+      <w:rPr>
+        <w:rFonts w:ascii="Wingdings" w:hAnsi="Wingdings" w:hint="default"/>
+        <w:sz w:val="20"/>
+      </w:rPr>
+    </w:lvl>
+    <w:lvl w:ilvl="4" w:tentative="1">
+      <w:start w:val="1"/>
+      <w:numFmt w:val="bullet"/>
+      <w:lvlText w:val=""/>
+      <w:lvlJc w:val="left"/>
+      <w:pPr>
+        <w:tabs>
+          <w:tab w:val="num" w:pos="3600"/>
+        </w:tabs>
+        <w:ind w:left="3600" w:hanging="360"/>
+      </w:pPr>
+      <w:rPr>
+        <w:rFonts w:ascii="Wingdings" w:hAnsi="Wingdings" w:hint="default"/>
+        <w:sz w:val="20"/>
+      </w:rPr>
+    </w:lvl>
+    <w:lvl w:ilvl="5" w:tentative="1">
+      <w:start w:val="1"/>
+      <w:numFmt w:val="bullet"/>
+      <w:lvlText w:val=""/>
+      <w:lvlJc w:val="left"/>
+      <w:pPr>
+        <w:tabs>
+          <w:tab w:val="num" w:pos="4320"/>
+        </w:tabs>
+        <w:ind w:left="4320" w:hanging="360"/>
+      </w:pPr>
+      <w:rPr>
+        <w:rFonts w:ascii="Wingdings" w:hAnsi="Wingdings" w:hint="default"/>
+        <w:sz w:val="20"/>
+      </w:rPr>
+    </w:lvl>
+    <w:lvl w:ilvl="6" w:tentative="1">
+      <w:start w:val="1"/>
+      <w:numFmt w:val="bullet"/>
+      <w:lvlText w:val=""/>
+      <w:lvlJc w:val="left"/>
+      <w:pPr>
+        <w:tabs>
+          <w:tab w:val="num" w:pos="5040"/>
+        </w:tabs>
+        <w:ind w:left="5040" w:hanging="360"/>
+      </w:pPr>
+      <w:rPr>
+        <w:rFonts w:ascii="Wingdings" w:hAnsi="Wingdings" w:hint="default"/>
+        <w:sz w:val="20"/>
+      </w:rPr>
+    </w:lvl>
+    <w:lvl w:ilvl="7" w:tentative="1">
+      <w:start w:val="1"/>
+      <w:numFmt w:val="bullet"/>
+      <w:lvlText w:val=""/>
+      <w:lvlJc w:val="left"/>
+      <w:pPr>
+        <w:tabs>
+          <w:tab w:val="num" w:pos="5760"/>
+        </w:tabs>
+        <w:ind w:left="5760" w:hanging="360"/>
+      </w:pPr>
+      <w:rPr>
+        <w:rFonts w:ascii="Wingdings" w:hAnsi="Wingdings" w:hint="default"/>
+        <w:sz w:val="20"/>
+      </w:rPr>
+    </w:lvl>
+    <w:lvl w:ilvl="8" w:tentative="1">
+      <w:start w:val="1"/>
+      <w:numFmt w:val="bullet"/>
+      <w:lvlText w:val=""/>
+      <w:lvlJc w:val="left"/>
+      <w:pPr>
+        <w:tabs>
+          <w:tab w:val="num" w:pos="6480"/>
+        </w:tabs>
+        <w:ind w:left="6480" w:hanging="360"/>
+      </w:pPr>
+      <w:rPr>
+        <w:rFonts w:ascii="Wingdings" w:hAnsi="Wingdings" w:hint="default"/>
+        <w:sz w:val="20"/>
+      </w:rPr>
+    </w:lvl>
+  </w:abstractNum>
+  <w:abstractNum w:abstractNumId="6" w15:restartNumberingAfterBreak="0">
     <w:nsid w:val="3F17096D"/>
     <w:multiLevelType w:val="multilevel"/>
     <w:tmpl w:val="0F96400A"/>
@@ -5192,7 +6762,7 @@
       </w:pPr>
     </w:lvl>
   </w:abstractNum>
-  <w:abstractNum w:abstractNumId="5" w15:restartNumberingAfterBreak="0">
+  <w:abstractNum w:abstractNumId="7" w15:restartNumberingAfterBreak="0">
     <w:nsid w:val="473A3FD3"/>
     <w:multiLevelType w:val="multilevel"/>
     <w:tmpl w:val="29D07AAE"/>
@@ -5305,7 +6875,7 @@
       </w:rPr>
     </w:lvl>
   </w:abstractNum>
-  <w:abstractNum w:abstractNumId="6" w15:restartNumberingAfterBreak="0">
+  <w:abstractNum w:abstractNumId="8" w15:restartNumberingAfterBreak="0">
     <w:nsid w:val="47F257F3"/>
     <w:multiLevelType w:val="hybridMultilevel"/>
     <w:tmpl w:val="B6C2B64C"/>
@@ -5418,7 +6988,305 @@
       </w:rPr>
     </w:lvl>
   </w:abstractNum>
-  <w:abstractNum w:abstractNumId="7" w15:restartNumberingAfterBreak="0">
+  <w:abstractNum w:abstractNumId="9" w15:restartNumberingAfterBreak="0">
+    <w:nsid w:val="4E165864"/>
+    <w:multiLevelType w:val="multilevel"/>
+    <w:tmpl w:val="967C80DE"/>
+    <w:lvl w:ilvl="0">
+      <w:start w:val="1"/>
+      <w:numFmt w:val="bullet"/>
+      <w:lvlText w:val=""/>
+      <w:lvlJc w:val="left"/>
+      <w:pPr>
+        <w:tabs>
+          <w:tab w:val="num" w:pos="720"/>
+        </w:tabs>
+        <w:ind w:left="720" w:hanging="360"/>
+      </w:pPr>
+      <w:rPr>
+        <w:rFonts w:ascii="Symbol" w:hAnsi="Symbol" w:hint="default"/>
+        <w:sz w:val="20"/>
+      </w:rPr>
+    </w:lvl>
+    <w:lvl w:ilvl="1" w:tentative="1">
+      <w:start w:val="1"/>
+      <w:numFmt w:val="bullet"/>
+      <w:lvlText w:val="o"/>
+      <w:lvlJc w:val="left"/>
+      <w:pPr>
+        <w:tabs>
+          <w:tab w:val="num" w:pos="1440"/>
+        </w:tabs>
+        <w:ind w:left="1440" w:hanging="360"/>
+      </w:pPr>
+      <w:rPr>
+        <w:rFonts w:ascii="Courier New" w:hAnsi="Courier New" w:hint="default"/>
+        <w:sz w:val="20"/>
+      </w:rPr>
+    </w:lvl>
+    <w:lvl w:ilvl="2" w:tentative="1">
+      <w:start w:val="1"/>
+      <w:numFmt w:val="bullet"/>
+      <w:lvlText w:val=""/>
+      <w:lvlJc w:val="left"/>
+      <w:pPr>
+        <w:tabs>
+          <w:tab w:val="num" w:pos="2160"/>
+        </w:tabs>
+        <w:ind w:left="2160" w:hanging="360"/>
+      </w:pPr>
+      <w:rPr>
+        <w:rFonts w:ascii="Wingdings" w:hAnsi="Wingdings" w:hint="default"/>
+        <w:sz w:val="20"/>
+      </w:rPr>
+    </w:lvl>
+    <w:lvl w:ilvl="3" w:tentative="1">
+      <w:start w:val="1"/>
+      <w:numFmt w:val="bullet"/>
+      <w:lvlText w:val=""/>
+      <w:lvlJc w:val="left"/>
+      <w:pPr>
+        <w:tabs>
+          <w:tab w:val="num" w:pos="2880"/>
+        </w:tabs>
+        <w:ind w:left="2880" w:hanging="360"/>
+      </w:pPr>
+      <w:rPr>
+        <w:rFonts w:ascii="Wingdings" w:hAnsi="Wingdings" w:hint="default"/>
+        <w:sz w:val="20"/>
+      </w:rPr>
+    </w:lvl>
+    <w:lvl w:ilvl="4" w:tentative="1">
+      <w:start w:val="1"/>
+      <w:numFmt w:val="bullet"/>
+      <w:lvlText w:val=""/>
+      <w:lvlJc w:val="left"/>
+      <w:pPr>
+        <w:tabs>
+          <w:tab w:val="num" w:pos="3600"/>
+        </w:tabs>
+        <w:ind w:left="3600" w:hanging="360"/>
+      </w:pPr>
+      <w:rPr>
+        <w:rFonts w:ascii="Wingdings" w:hAnsi="Wingdings" w:hint="default"/>
+        <w:sz w:val="20"/>
+      </w:rPr>
+    </w:lvl>
+    <w:lvl w:ilvl="5" w:tentative="1">
+      <w:start w:val="1"/>
+      <w:numFmt w:val="bullet"/>
+      <w:lvlText w:val=""/>
+      <w:lvlJc w:val="left"/>
+      <w:pPr>
+        <w:tabs>
+          <w:tab w:val="num" w:pos="4320"/>
+        </w:tabs>
+        <w:ind w:left="4320" w:hanging="360"/>
+      </w:pPr>
+      <w:rPr>
+        <w:rFonts w:ascii="Wingdings" w:hAnsi="Wingdings" w:hint="default"/>
+        <w:sz w:val="20"/>
+      </w:rPr>
+    </w:lvl>
+    <w:lvl w:ilvl="6" w:tentative="1">
+      <w:start w:val="1"/>
+      <w:numFmt w:val="bullet"/>
+      <w:lvlText w:val=""/>
+      <w:lvlJc w:val="left"/>
+      <w:pPr>
+        <w:tabs>
+          <w:tab w:val="num" w:pos="5040"/>
+        </w:tabs>
+        <w:ind w:left="5040" w:hanging="360"/>
+      </w:pPr>
+      <w:rPr>
+        <w:rFonts w:ascii="Wingdings" w:hAnsi="Wingdings" w:hint="default"/>
+        <w:sz w:val="20"/>
+      </w:rPr>
+    </w:lvl>
+    <w:lvl w:ilvl="7" w:tentative="1">
+      <w:start w:val="1"/>
+      <w:numFmt w:val="bullet"/>
+      <w:lvlText w:val=""/>
+      <w:lvlJc w:val="left"/>
+      <w:pPr>
+        <w:tabs>
+          <w:tab w:val="num" w:pos="5760"/>
+        </w:tabs>
+        <w:ind w:left="5760" w:hanging="360"/>
+      </w:pPr>
+      <w:rPr>
+        <w:rFonts w:ascii="Wingdings" w:hAnsi="Wingdings" w:hint="default"/>
+        <w:sz w:val="20"/>
+      </w:rPr>
+    </w:lvl>
+    <w:lvl w:ilvl="8" w:tentative="1">
+      <w:start w:val="1"/>
+      <w:numFmt w:val="bullet"/>
+      <w:lvlText w:val=""/>
+      <w:lvlJc w:val="left"/>
+      <w:pPr>
+        <w:tabs>
+          <w:tab w:val="num" w:pos="6480"/>
+        </w:tabs>
+        <w:ind w:left="6480" w:hanging="360"/>
+      </w:pPr>
+      <w:rPr>
+        <w:rFonts w:ascii="Wingdings" w:hAnsi="Wingdings" w:hint="default"/>
+        <w:sz w:val="20"/>
+      </w:rPr>
+    </w:lvl>
+  </w:abstractNum>
+  <w:abstractNum w:abstractNumId="10" w15:restartNumberingAfterBreak="0">
+    <w:nsid w:val="52555530"/>
+    <w:multiLevelType w:val="multilevel"/>
+    <w:tmpl w:val="996C2FD8"/>
+    <w:lvl w:ilvl="0">
+      <w:start w:val="1"/>
+      <w:numFmt w:val="bullet"/>
+      <w:lvlText w:val=""/>
+      <w:lvlJc w:val="left"/>
+      <w:pPr>
+        <w:tabs>
+          <w:tab w:val="num" w:pos="720"/>
+        </w:tabs>
+        <w:ind w:left="720" w:hanging="360"/>
+      </w:pPr>
+      <w:rPr>
+        <w:rFonts w:ascii="Symbol" w:hAnsi="Symbol" w:hint="default"/>
+        <w:sz w:val="20"/>
+      </w:rPr>
+    </w:lvl>
+    <w:lvl w:ilvl="1" w:tentative="1">
+      <w:start w:val="1"/>
+      <w:numFmt w:val="bullet"/>
+      <w:lvlText w:val="o"/>
+      <w:lvlJc w:val="left"/>
+      <w:pPr>
+        <w:tabs>
+          <w:tab w:val="num" w:pos="1440"/>
+        </w:tabs>
+        <w:ind w:left="1440" w:hanging="360"/>
+      </w:pPr>
+      <w:rPr>
+        <w:rFonts w:ascii="Courier New" w:hAnsi="Courier New" w:hint="default"/>
+        <w:sz w:val="20"/>
+      </w:rPr>
+    </w:lvl>
+    <w:lvl w:ilvl="2" w:tentative="1">
+      <w:start w:val="1"/>
+      <w:numFmt w:val="bullet"/>
+      <w:lvlText w:val=""/>
+      <w:lvlJc w:val="left"/>
+      <w:pPr>
+        <w:tabs>
+          <w:tab w:val="num" w:pos="2160"/>
+        </w:tabs>
+        <w:ind w:left="2160" w:hanging="360"/>
+      </w:pPr>
+      <w:rPr>
+        <w:rFonts w:ascii="Wingdings" w:hAnsi="Wingdings" w:hint="default"/>
+        <w:sz w:val="20"/>
+      </w:rPr>
+    </w:lvl>
+    <w:lvl w:ilvl="3" w:tentative="1">
+      <w:start w:val="1"/>
+      <w:numFmt w:val="bullet"/>
+      <w:lvlText w:val=""/>
+      <w:lvlJc w:val="left"/>
+      <w:pPr>
+        <w:tabs>
+          <w:tab w:val="num" w:pos="2880"/>
+        </w:tabs>
+        <w:ind w:left="2880" w:hanging="360"/>
+      </w:pPr>
+      <w:rPr>
+        <w:rFonts w:ascii="Wingdings" w:hAnsi="Wingdings" w:hint="default"/>
+        <w:sz w:val="20"/>
+      </w:rPr>
+    </w:lvl>
+    <w:lvl w:ilvl="4" w:tentative="1">
+      <w:start w:val="1"/>
+      <w:numFmt w:val="bullet"/>
+      <w:lvlText w:val=""/>
+      <w:lvlJc w:val="left"/>
+      <w:pPr>
+        <w:tabs>
+          <w:tab w:val="num" w:pos="3600"/>
+        </w:tabs>
+        <w:ind w:left="3600" w:hanging="360"/>
+      </w:pPr>
+      <w:rPr>
+        <w:rFonts w:ascii="Wingdings" w:hAnsi="Wingdings" w:hint="default"/>
+        <w:sz w:val="20"/>
+      </w:rPr>
+    </w:lvl>
+    <w:lvl w:ilvl="5" w:tentative="1">
+      <w:start w:val="1"/>
+      <w:numFmt w:val="bullet"/>
+      <w:lvlText w:val=""/>
+      <w:lvlJc w:val="left"/>
+      <w:pPr>
+        <w:tabs>
+          <w:tab w:val="num" w:pos="4320"/>
+        </w:tabs>
+        <w:ind w:left="4320" w:hanging="360"/>
+      </w:pPr>
+      <w:rPr>
+        <w:rFonts w:ascii="Wingdings" w:hAnsi="Wingdings" w:hint="default"/>
+        <w:sz w:val="20"/>
+      </w:rPr>
+    </w:lvl>
+    <w:lvl w:ilvl="6" w:tentative="1">
+      <w:start w:val="1"/>
+      <w:numFmt w:val="bullet"/>
+      <w:lvlText w:val=""/>
+      <w:lvlJc w:val="left"/>
+      <w:pPr>
+        <w:tabs>
+          <w:tab w:val="num" w:pos="5040"/>
+        </w:tabs>
+        <w:ind w:left="5040" w:hanging="360"/>
+      </w:pPr>
+      <w:rPr>
+        <w:rFonts w:ascii="Wingdings" w:hAnsi="Wingdings" w:hint="default"/>
+        <w:sz w:val="20"/>
+      </w:rPr>
+    </w:lvl>
+    <w:lvl w:ilvl="7" w:tentative="1">
+      <w:start w:val="1"/>
+      <w:numFmt w:val="bullet"/>
+      <w:lvlText w:val=""/>
+      <w:lvlJc w:val="left"/>
+      <w:pPr>
+        <w:tabs>
+          <w:tab w:val="num" w:pos="5760"/>
+        </w:tabs>
+        <w:ind w:left="5760" w:hanging="360"/>
+      </w:pPr>
+      <w:rPr>
+        <w:rFonts w:ascii="Wingdings" w:hAnsi="Wingdings" w:hint="default"/>
+        <w:sz w:val="20"/>
+      </w:rPr>
+    </w:lvl>
+    <w:lvl w:ilvl="8" w:tentative="1">
+      <w:start w:val="1"/>
+      <w:numFmt w:val="bullet"/>
+      <w:lvlText w:val=""/>
+      <w:lvlJc w:val="left"/>
+      <w:pPr>
+        <w:tabs>
+          <w:tab w:val="num" w:pos="6480"/>
+        </w:tabs>
+        <w:ind w:left="6480" w:hanging="360"/>
+      </w:pPr>
+      <w:rPr>
+        <w:rFonts w:ascii="Wingdings" w:hAnsi="Wingdings" w:hint="default"/>
+        <w:sz w:val="20"/>
+      </w:rPr>
+    </w:lvl>
+  </w:abstractNum>
+  <w:abstractNum w:abstractNumId="11" w15:restartNumberingAfterBreak="0">
     <w:nsid w:val="5BF877AE"/>
     <w:multiLevelType w:val="multilevel"/>
     <w:tmpl w:val="4BDCA6DC"/>
@@ -5499,7 +7367,156 @@
       </w:pPr>
     </w:lvl>
   </w:abstractNum>
-  <w:abstractNum w:abstractNumId="8" w15:restartNumberingAfterBreak="0">
+  <w:abstractNum w:abstractNumId="12" w15:restartNumberingAfterBreak="0">
+    <w:nsid w:val="5F0808E6"/>
+    <w:multiLevelType w:val="multilevel"/>
+    <w:tmpl w:val="2BB64DB0"/>
+    <w:lvl w:ilvl="0">
+      <w:start w:val="1"/>
+      <w:numFmt w:val="bullet"/>
+      <w:lvlText w:val=""/>
+      <w:lvlJc w:val="left"/>
+      <w:pPr>
+        <w:tabs>
+          <w:tab w:val="num" w:pos="720"/>
+        </w:tabs>
+        <w:ind w:left="720" w:hanging="360"/>
+      </w:pPr>
+      <w:rPr>
+        <w:rFonts w:ascii="Symbol" w:hAnsi="Symbol" w:hint="default"/>
+        <w:sz w:val="20"/>
+      </w:rPr>
+    </w:lvl>
+    <w:lvl w:ilvl="1" w:tentative="1">
+      <w:start w:val="1"/>
+      <w:numFmt w:val="bullet"/>
+      <w:lvlText w:val="o"/>
+      <w:lvlJc w:val="left"/>
+      <w:pPr>
+        <w:tabs>
+          <w:tab w:val="num" w:pos="1440"/>
+        </w:tabs>
+        <w:ind w:left="1440" w:hanging="360"/>
+      </w:pPr>
+      <w:rPr>
+        <w:rFonts w:ascii="Courier New" w:hAnsi="Courier New" w:hint="default"/>
+        <w:sz w:val="20"/>
+      </w:rPr>
+    </w:lvl>
+    <w:lvl w:ilvl="2" w:tentative="1">
+      <w:start w:val="1"/>
+      <w:numFmt w:val="bullet"/>
+      <w:lvlText w:val=""/>
+      <w:lvlJc w:val="left"/>
+      <w:pPr>
+        <w:tabs>
+          <w:tab w:val="num" w:pos="2160"/>
+        </w:tabs>
+        <w:ind w:left="2160" w:hanging="360"/>
+      </w:pPr>
+      <w:rPr>
+        <w:rFonts w:ascii="Wingdings" w:hAnsi="Wingdings" w:hint="default"/>
+        <w:sz w:val="20"/>
+      </w:rPr>
+    </w:lvl>
+    <w:lvl w:ilvl="3" w:tentative="1">
+      <w:start w:val="1"/>
+      <w:numFmt w:val="bullet"/>
+      <w:lvlText w:val=""/>
+      <w:lvlJc w:val="left"/>
+      <w:pPr>
+        <w:tabs>
+          <w:tab w:val="num" w:pos="2880"/>
+        </w:tabs>
+        <w:ind w:left="2880" w:hanging="360"/>
+      </w:pPr>
+      <w:rPr>
+        <w:rFonts w:ascii="Wingdings" w:hAnsi="Wingdings" w:hint="default"/>
+        <w:sz w:val="20"/>
+      </w:rPr>
+    </w:lvl>
+    <w:lvl w:ilvl="4" w:tentative="1">
+      <w:start w:val="1"/>
+      <w:numFmt w:val="bullet"/>
+      <w:lvlText w:val=""/>
+      <w:lvlJc w:val="left"/>
+      <w:pPr>
+        <w:tabs>
+          <w:tab w:val="num" w:pos="3600"/>
+        </w:tabs>
+        <w:ind w:left="3600" w:hanging="360"/>
+      </w:pPr>
+      <w:rPr>
+        <w:rFonts w:ascii="Wingdings" w:hAnsi="Wingdings" w:hint="default"/>
+        <w:sz w:val="20"/>
+      </w:rPr>
+    </w:lvl>
+    <w:lvl w:ilvl="5" w:tentative="1">
+      <w:start w:val="1"/>
+      <w:numFmt w:val="bullet"/>
+      <w:lvlText w:val=""/>
+      <w:lvlJc w:val="left"/>
+      <w:pPr>
+        <w:tabs>
+          <w:tab w:val="num" w:pos="4320"/>
+        </w:tabs>
+        <w:ind w:left="4320" w:hanging="360"/>
+      </w:pPr>
+      <w:rPr>
+        <w:rFonts w:ascii="Wingdings" w:hAnsi="Wingdings" w:hint="default"/>
+        <w:sz w:val="20"/>
+      </w:rPr>
+    </w:lvl>
+    <w:lvl w:ilvl="6" w:tentative="1">
+      <w:start w:val="1"/>
+      <w:numFmt w:val="bullet"/>
+      <w:lvlText w:val=""/>
+      <w:lvlJc w:val="left"/>
+      <w:pPr>
+        <w:tabs>
+          <w:tab w:val="num" w:pos="5040"/>
+        </w:tabs>
+        <w:ind w:left="5040" w:hanging="360"/>
+      </w:pPr>
+      <w:rPr>
+        <w:rFonts w:ascii="Wingdings" w:hAnsi="Wingdings" w:hint="default"/>
+        <w:sz w:val="20"/>
+      </w:rPr>
+    </w:lvl>
+    <w:lvl w:ilvl="7" w:tentative="1">
+      <w:start w:val="1"/>
+      <w:numFmt w:val="bullet"/>
+      <w:lvlText w:val=""/>
+      <w:lvlJc w:val="left"/>
+      <w:pPr>
+        <w:tabs>
+          <w:tab w:val="num" w:pos="5760"/>
+        </w:tabs>
+        <w:ind w:left="5760" w:hanging="360"/>
+      </w:pPr>
+      <w:rPr>
+        <w:rFonts w:ascii="Wingdings" w:hAnsi="Wingdings" w:hint="default"/>
+        <w:sz w:val="20"/>
+      </w:rPr>
+    </w:lvl>
+    <w:lvl w:ilvl="8" w:tentative="1">
+      <w:start w:val="1"/>
+      <w:numFmt w:val="bullet"/>
+      <w:lvlText w:val=""/>
+      <w:lvlJc w:val="left"/>
+      <w:pPr>
+        <w:tabs>
+          <w:tab w:val="num" w:pos="6480"/>
+        </w:tabs>
+        <w:ind w:left="6480" w:hanging="360"/>
+      </w:pPr>
+      <w:rPr>
+        <w:rFonts w:ascii="Wingdings" w:hAnsi="Wingdings" w:hint="default"/>
+        <w:sz w:val="20"/>
+      </w:rPr>
+    </w:lvl>
+  </w:abstractNum>
+  <w:abstractNum w:abstractNumId="13" w15:restartNumberingAfterBreak="0">
     <w:nsid w:val="72213658"/>
     <w:multiLevelType w:val="multilevel"/>
     <w:tmpl w:val="1BEECA10"/>
@@ -5648,7 +7665,7 @@
       </w:rPr>
     </w:lvl>
   </w:abstractNum>
-  <w:abstractNum w:abstractNumId="9" w15:restartNumberingAfterBreak="0">
+  <w:abstractNum w:abstractNumId="14" w15:restartNumberingAfterBreak="0">
     <w:nsid w:val="7E916118"/>
     <w:multiLevelType w:val="multilevel"/>
     <w:tmpl w:val="7DFA4CF2"/>
@@ -5738,34 +7755,49 @@
     </w:lvl>
   </w:abstractNum>
   <w:num w:numId="1" w16cid:durableId="1502157242">
+    <w:abstractNumId w:val="11"/>
+  </w:num>
+  <w:num w:numId="2" w16cid:durableId="1038166962">
     <w:abstractNumId w:val="7"/>
   </w:num>
-  <w:num w:numId="2" w16cid:durableId="1038166962">
-    <w:abstractNumId w:val="5"/>
+  <w:num w:numId="3" w16cid:durableId="67922738">
+    <w:abstractNumId w:val="4"/>
   </w:num>
-  <w:num w:numId="3" w16cid:durableId="67922738">
+  <w:num w:numId="4" w16cid:durableId="471093407">
+    <w:abstractNumId w:val="14"/>
+  </w:num>
+  <w:num w:numId="5" w16cid:durableId="382753537">
+    <w:abstractNumId w:val="6"/>
+  </w:num>
+  <w:num w:numId="6" w16cid:durableId="681859963">
+    <w:abstractNumId w:val="8"/>
+  </w:num>
+  <w:num w:numId="7" w16cid:durableId="1859269235">
     <w:abstractNumId w:val="3"/>
   </w:num>
-  <w:num w:numId="4" w16cid:durableId="471093407">
-    <w:abstractNumId w:val="9"/>
-  </w:num>
-  <w:num w:numId="5" w16cid:durableId="382753537">
-    <w:abstractNumId w:val="4"/>
-  </w:num>
-  <w:num w:numId="6" w16cid:durableId="681859963">
-    <w:abstractNumId w:val="6"/>
-  </w:num>
-  <w:num w:numId="7" w16cid:durableId="1859269235">
+  <w:num w:numId="8" w16cid:durableId="575751543">
     <w:abstractNumId w:val="2"/>
   </w:num>
-  <w:num w:numId="8" w16cid:durableId="575751543">
-    <w:abstractNumId w:val="1"/>
-  </w:num>
   <w:num w:numId="9" w16cid:durableId="981886819">
-    <w:abstractNumId w:val="8"/>
+    <w:abstractNumId w:val="13"/>
   </w:num>
   <w:num w:numId="10" w16cid:durableId="1574658574">
     <w:abstractNumId w:val="0"/>
+  </w:num>
+  <w:num w:numId="11" w16cid:durableId="2145804902">
+    <w:abstractNumId w:val="5"/>
+  </w:num>
+  <w:num w:numId="12" w16cid:durableId="619896">
+    <w:abstractNumId w:val="10"/>
+  </w:num>
+  <w:num w:numId="13" w16cid:durableId="1720590846">
+    <w:abstractNumId w:val="12"/>
+  </w:num>
+  <w:num w:numId="14" w16cid:durableId="346030139">
+    <w:abstractNumId w:val="9"/>
+  </w:num>
+  <w:num w:numId="15" w16cid:durableId="1630549251">
+    <w:abstractNumId w:val="1"/>
   </w:num>
 </w:numbering>
 </file>
@@ -6168,7 +8200,7 @@
   <w:style w:type="paragraph" w:default="1" w:styleId="Normal">
     <w:name w:val="Normal"/>
     <w:qFormat/>
-    <w:rsid w:val="0062092F"/>
+    <w:rsid w:val="006E6992"/>
     <w:rPr>
       <w:rFonts w:asciiTheme="minorHAnsi" w:hAnsiTheme="minorHAnsi" w:cstheme="minorHAnsi"/>
       <w:sz w:val="28"/>
@@ -6806,28 +8838,28 @@
 </file>
 
 <file path=customXml/item1.xml><?xml version="1.0" encoding="utf-8"?>
-<b:Sources xmlns:b="http://schemas.openxmlformats.org/officeDocument/2006/bibliography" xmlns="http://schemas.openxmlformats.org/officeDocument/2006/bibliography" SelectedStyle="\APASixthEditionOfficeOnline.xsl" StyleName="APA" Version="6"/>
-</file>
-
-<file path=customXml/item2.xml><?xml version="1.0" encoding="utf-8"?>
 <go:gDocsCustomXmlDataStorage xmlns:go="http://customooxmlschemas.google.com/" xmlns:r="http://schemas.openxmlformats.org/officeDocument/2006/relationships" uri="GoogleDocsCustomDataVersion2">
   <go:docsCustomData xmlns:go="http://customooxmlschemas.google.com/" roundtripDataSignature="AMtx7mh6HM9uLpSR1Da0aeqCg+6eVaLycQ==">CgMxLjA4AHIhMVB2TEhVT2E3M2VqdnBmYzhSTWNFa0lEV28tQkhrdEFG</go:docsCustomData>
 </go:gDocsCustomXmlDataStorage>
 </file>
 
-<file path=customXml/itemProps1.xml><?xml version="1.0" encoding="utf-8"?>
-<ds:datastoreItem xmlns:ds="http://schemas.openxmlformats.org/officeDocument/2006/customXml" ds:itemID="{E46EDEEA-2686-406A-B468-970A231FFA63}">
-  <ds:schemaRefs>
-    <ds:schemaRef ds:uri="http://schemas.openxmlformats.org/officeDocument/2006/bibliography"/>
-  </ds:schemaRefs>
-</ds:datastoreItem>
+<file path=customXml/item2.xml><?xml version="1.0" encoding="utf-8"?>
+<b:Sources xmlns:b="http://schemas.openxmlformats.org/officeDocument/2006/bibliography" xmlns="http://schemas.openxmlformats.org/officeDocument/2006/bibliography" SelectedStyle="\APASixthEditionOfficeOnline.xsl" StyleName="APA" Version="6"/>
 </file>
 
-<file path=customXml/itemProps2.xml><?xml version="1.0" encoding="utf-8"?>
+<file path=customXml/itemProps1.xml><?xml version="1.0" encoding="utf-8"?>
 <ds:datastoreItem xmlns:ds="http://schemas.openxmlformats.org/officeDocument/2006/customXml" ds:itemID="{11111111-1234-1234-1234-123412341234}">
   <ds:schemaRefs>
     <ds:schemaRef ds:uri="http://customooxmlschemas.google.com/"/>
     <ds:schemaRef ds:uri="http://schemas.openxmlformats.org/officeDocument/2006/relationships"/>
   </ds:schemaRefs>
 </ds:datastoreItem>
+</file>
+
+<file path=customXml/itemProps2.xml><?xml version="1.0" encoding="utf-8"?>
+<ds:datastoreItem xmlns:ds="http://schemas.openxmlformats.org/officeDocument/2006/customXml" ds:itemID="{E46EDEEA-2686-406A-B468-970A231FFA63}">
+  <ds:schemaRefs>
+    <ds:schemaRef ds:uri="http://schemas.openxmlformats.org/officeDocument/2006/bibliography"/>
+  </ds:schemaRefs>
+</ds:datastoreItem>
 </file>
</xml_diff>